<commit_message>
Auto-save: 8 file(s) — 2026-10-16 09:11
</commit_message>
<xml_diff>
--- a/Projects/TekRevol/05-reports/TekRevol-ChatGPT-Ads-Healthcare-Audit-Cover-A.docx
+++ b/Projects/TekRevol/05-reports/TekRevol-ChatGPT-Ads-Healthcare-Audit-Cover-A.docx
@@ -6,8 +6,6 @@
       <w:pPr>
         <w:spacing w:before="11250" w:after="80"/>
       </w:pPr>
-      <w:bookmarkStart w:id="0" w:name="_GoBack"/>
-      <w:bookmarkEnd w:id="0"/>
       <w:r>
         <w:rPr>
           <w:noProof/>
@@ -74,13 +72,23 @@
       <w:pPr>
         <w:spacing w:after="60"/>
       </w:pPr>
+      <w:proofErr w:type="spellStart"/>
       <w:r>
         <w:rPr>
           <w:rFonts w:ascii="Funnel Display" w:eastAsia="Funnel Display" w:hAnsi="Funnel Display" w:cs="Funnel Display"/>
           <w:sz w:val="76"/>
           <w:szCs w:val="76"/>
         </w:rPr>
-        <w:t>ChatGPT Ads Audit</w:t>
+        <w:t>ChatGPT</w:t>
+      </w:r>
+      <w:proofErr w:type="spellEnd"/>
+      <w:r>
+        <w:rPr>
+          <w:rFonts w:ascii="Funnel Display" w:eastAsia="Funnel Display" w:hAnsi="Funnel Display" w:cs="Funnel Display"/>
+          <w:sz w:val="76"/>
+          <w:szCs w:val="76"/>
+        </w:rPr>
+        <w:t xml:space="preserve"> Ads Audit</w:t>
       </w:r>
     </w:p>
     <w:p>
@@ -141,7 +149,23 @@
         <w:t>Sources:</w:t>
       </w:r>
       <w:r>
-        <w:t xml:space="preserve"> OpenAI Ads Manager (TekRevol LLC account, read-only, 1 Jun to 15 Oct 2026, Pacific time), the live landing page and </w:t>
+        <w:t xml:space="preserve"> </w:t>
+      </w:r>
+      <w:proofErr w:type="spellStart"/>
+      <w:r>
+        <w:t>OpenAI</w:t>
+      </w:r>
+      <w:proofErr w:type="spellEnd"/>
+      <w:r>
+        <w:t xml:space="preserve"> Ads Manager (</w:t>
+      </w:r>
+      <w:proofErr w:type="spellStart"/>
+      <w:r>
+        <w:t>TekRevol</w:t>
+      </w:r>
+      <w:proofErr w:type="spellEnd"/>
+      <w:r>
+        <w:t xml:space="preserve"> LLC account, read-only, 1 Jun to 15 Oct 2026, Pacific time), the live landing page and </w:t>
       </w:r>
       <w:r>
         <w:rPr>
@@ -180,10 +204,27 @@
           <w:szCs w:val="14"/>
           <w:shd w:val="clear" w:color="auto" w:fill="E2F2E7"/>
         </w:rPr>
-        <w:t xml:space="preserve"> VERIFIED </w:t>
-      </w:r>
-      <w:r>
-        <w:t xml:space="preserve"> = seen in data or on the page · </w:t>
+        <w:t xml:space="preserve"> </w:t>
+      </w:r>
+      <w:proofErr w:type="gramStart"/>
+      <w:r>
+        <w:rPr>
+          <w:rFonts w:ascii="JetBrains Mono" w:eastAsia="JetBrains Mono" w:hAnsi="JetBrains Mono" w:cs="JetBrains Mono"/>
+          <w:b/>
+          <w:bCs/>
+          <w:color w:val="1E6B3A"/>
+          <w:sz w:val="14"/>
+          <w:szCs w:val="14"/>
+          <w:shd w:val="clear" w:color="auto" w:fill="E2F2E7"/>
+        </w:rPr>
+        <w:t xml:space="preserve">VERIFIED </w:t>
+      </w:r>
+      <w:r>
+        <w:t xml:space="preserve"> =</w:t>
+      </w:r>
+      <w:proofErr w:type="gramEnd"/>
+      <w:r>
+        <w:t xml:space="preserve"> seen in data or on the page · </w:t>
       </w:r>
       <w:r>
         <w:rPr>
@@ -210,19 +251,7 @@
           <w:szCs w:val="14"/>
           <w:shd w:val="clear" w:color="auto" w:fill="FFE8E0"/>
         </w:rPr>
-        <w:t xml:space="preserve"> NEE</w:t>
-      </w:r>
-      <w:r>
-        <w:rPr>
-          <w:rFonts w:ascii="JetBrains Mono" w:eastAsia="JetBrains Mono" w:hAnsi="JetBrains Mono" w:cs="JetBrains Mono"/>
-          <w:b/>
-          <w:bCs/>
-          <w:color w:val="C23A00"/>
-          <w:sz w:val="14"/>
-          <w:szCs w:val="14"/>
-          <w:shd w:val="clear" w:color="auto" w:fill="FFE8E0"/>
-        </w:rPr>
-        <w:t xml:space="preserve">DS DATA </w:t>
+        <w:t xml:space="preserve"> NEEDS DATA </w:t>
       </w:r>
       <w:r>
         <w:t xml:space="preserve"> = can't be confirmed yet.</w:t>
@@ -286,6 +315,7 @@
       <w:r>
         <w:t xml:space="preserve"> A </w:t>
       </w:r>
+      <w:proofErr w:type="spellStart"/>
       <w:r>
         <w:rPr>
           <w:rFonts w:ascii="JetBrains Mono" w:eastAsia="JetBrains Mono" w:hAnsi="JetBrains Mono" w:cs="JetBrains Mono"/>
@@ -295,6 +325,7 @@
         </w:rPr>
         <w:t>lead_created</w:t>
       </w:r>
+      <w:proofErr w:type="spellEnd"/>
       <w:r>
         <w:t xml:space="preserve"> event exists in Ads Manager, but it was never installed on the site or linked to the campaign. Ads Manager shows </w:t>
       </w:r>
@@ -306,10 +337,15 @@
         <w:t>0 events ever</w:t>
       </w:r>
       <w:r>
-        <w:t>, and no OpenAI pixel loads on the page. The current rate (about 1 lead from 84 cl</w:t>
-      </w:r>
-      <w:r>
-        <w:t>icks, ~1.2%) comes from the CRM, not the ad platform. The platform has also been bidding with no conversion signal.</w:t>
+        <w:t xml:space="preserve">, and no </w:t>
+      </w:r>
+      <w:proofErr w:type="spellStart"/>
+      <w:r>
+        <w:t>OpenAI</w:t>
+      </w:r>
+      <w:proofErr w:type="spellEnd"/>
+      <w:r>
+        <w:t xml:space="preserve"> pixel loads on the page. The current rate (about 1 lead from 84 clicks, ~1.2%) comes from the CRM, not the ad platform. The platform has also been bidding with no conversion signal.</w:t>
       </w:r>
     </w:p>
     <w:p>
@@ -339,10 +375,15 @@
         <w:t>"AI for Clinics &amp; Home Health: automate admin work, patient workflows."</w:t>
       </w:r>
       <w:r>
-        <w:t xml:space="preserve"> The pag</w:t>
-      </w:r>
-      <w:r>
-        <w:t>e talks about blockchain, VR/AR/MR and "Let's Build Your App!" Every CTA leaves the page for a generic contact form with a required phone number and a visible reCAPTCHA.</w:t>
+        <w:t xml:space="preserve"> The page talks about blockchain, VR/AR/MR and "Let's Build Your App!" Every CTA leaves the page for a generic contact form with a required phone number and a visible </w:t>
+      </w:r>
+      <w:proofErr w:type="spellStart"/>
+      <w:r>
+        <w:t>reCAPTCHA</w:t>
+      </w:r>
+      <w:proofErr w:type="spellEnd"/>
+      <w:r>
+        <w:t>.</w:t>
       </w:r>
     </w:p>
     <w:p>
@@ -362,10 +403,15 @@
         <w:t>5% is reachable, but not on this page.</w:t>
       </w:r>
       <w:r>
-        <w:t xml:space="preserve"> It needs a dedicated healthcare operations land</w:t>
-      </w:r>
-      <w:r>
-        <w:t>ing page with the form above the fold, a concrete low-commitment offer, healthcare-only proof and working tracking. A copy edit to the current page won't get there.</w:t>
+        <w:t xml:space="preserve"> It needs a </w:t>
+      </w:r>
+      <w:proofErr w:type="gramStart"/>
+      <w:r>
+        <w:t>dedicated healthcare operations</w:t>
+      </w:r>
+      <w:proofErr w:type="gramEnd"/>
+      <w:r>
+        <w:t xml:space="preserve"> landing page with the form above the fold, a concrete low-commitment offer, healthcare-only proof and working tracking. A copy edit to the current page won't get there.</w:t>
       </w:r>
     </w:p>
     <w:p>
@@ -385,10 +431,7 @@
         <w:t>Do first:</w:t>
       </w:r>
       <w:r>
-        <w:t xml:space="preserve"> install and link conversion tracking. Then build the dedicated page before turnin</w:t>
-      </w:r>
-      <w:r>
-        <w:t>g the campaign back on.</w:t>
+        <w:t xml:space="preserve"> install and link conversion tracking. Then build the dedicated page before turning the campaign back on.</w:t>
       </w:r>
     </w:p>
     <w:p>
@@ -522,6 +565,7 @@
             <w:pPr>
               <w:spacing w:line="260" w:lineRule="auto"/>
             </w:pPr>
+            <w:proofErr w:type="spellStart"/>
             <w:r>
               <w:rPr>
                 <w:rFonts w:ascii="JetBrains Mono" w:eastAsia="JetBrains Mono" w:hAnsi="JetBrains Mono" w:cs="JetBrains Mono"/>
@@ -529,7 +573,17 @@
                 <w:sz w:val="15"/>
                 <w:szCs w:val="15"/>
               </w:rPr>
-              <w:t>Impr.</w:t>
+              <w:t>Impr</w:t>
+            </w:r>
+            <w:proofErr w:type="spellEnd"/>
+            <w:r>
+              <w:rPr>
+                <w:rFonts w:ascii="JetBrains Mono" w:eastAsia="JetBrains Mono" w:hAnsi="JetBrains Mono" w:cs="JetBrains Mono"/>
+                <w:color w:val="FFFFFF"/>
+                <w:sz w:val="15"/>
+                <w:szCs w:val="15"/>
+              </w:rPr>
+              <w:t>.</w:t>
             </w:r>
           </w:p>
         </w:tc>
@@ -1746,10 +1800,15 @@
         <w:spacing w:after="120" w:line="300" w:lineRule="auto"/>
       </w:pPr>
       <w:r>
-        <w:t xml:space="preserve">Source: OpenAI Ads Manager, 1 Jun to 15 Oct 2026. Campaign started 16 Jun 2026, budget $200/day, manual bidding, billed per click. Campaign and ad groups are now disabled ("Not serving"). The "Testing" campaign had no delivery, and its homepage ad is "Not </w:t>
-      </w:r>
-      <w:r>
-        <w:t>approved".</w:t>
+        <w:t xml:space="preserve">Source: </w:t>
+      </w:r>
+      <w:proofErr w:type="spellStart"/>
+      <w:r>
+        <w:t>OpenAI</w:t>
+      </w:r>
+      <w:proofErr w:type="spellEnd"/>
+      <w:r>
+        <w:t xml:space="preserve"> Ads Manager, 1 Jun to 15 Oct 2026. Campaign started 16 Jun 2026, budget $200/day, manual bidding, billed per click. Campaign and ad groups are now disabled ("Not serving"). The "Testing" campaign had no delivery, and its homepage ad is "Not approved".</w:t>
       </w:r>
     </w:p>
     <w:p>
@@ -1844,6 +1903,7 @@
             <w:pPr>
               <w:spacing w:line="260" w:lineRule="auto"/>
             </w:pPr>
+            <w:proofErr w:type="spellStart"/>
             <w:r>
               <w:rPr>
                 <w:rFonts w:ascii="JetBrains Mono" w:eastAsia="JetBrains Mono" w:hAnsi="JetBrains Mono" w:cs="JetBrains Mono"/>
@@ -1851,7 +1911,17 @@
                 <w:sz w:val="15"/>
                 <w:szCs w:val="15"/>
               </w:rPr>
-              <w:t>Impr.</w:t>
+              <w:t>Impr</w:t>
+            </w:r>
+            <w:proofErr w:type="spellEnd"/>
+            <w:r>
+              <w:rPr>
+                <w:rFonts w:ascii="JetBrains Mono" w:eastAsia="JetBrains Mono" w:hAnsi="JetBrains Mono" w:cs="JetBrains Mono"/>
+                <w:color w:val="FFFFFF"/>
+                <w:sz w:val="15"/>
+                <w:szCs w:val="15"/>
+              </w:rPr>
+              <w:t>.</w:t>
             </w:r>
           </w:p>
         </w:tc>
@@ -2465,7 +2535,15 @@
                 <w:sz w:val="18"/>
                 <w:szCs w:val="18"/>
               </w:rPr>
-              <w:t xml:space="preserve">~1.2% (1 lead / 84 clicks; CRM, per Sana) </w:t>
+              <w:t xml:space="preserve">~1.2% (1 lead / 84 clicks; CRM, per </w:t>
+            </w:r>
+            <w:proofErr w:type="gramStart"/>
+            <w:r>
+              <w:rPr>
+                <w:sz w:val="18"/>
+                <w:szCs w:val="18"/>
+              </w:rPr>
+              <w:t xml:space="preserve">Sana) </w:t>
             </w:r>
             <w:r>
               <w:rPr>
@@ -2477,7 +2555,20 @@
                 <w:szCs w:val="14"/>
                 <w:shd w:val="clear" w:color="auto" w:fill="FFE8E0"/>
               </w:rPr>
-              <w:t xml:space="preserve"> NEEDS DATA </w:t>
+              <w:t xml:space="preserve"> NEEDS</w:t>
+            </w:r>
+            <w:proofErr w:type="gramEnd"/>
+            <w:r>
+              <w:rPr>
+                <w:rFonts w:ascii="JetBrains Mono" w:eastAsia="JetBrains Mono" w:hAnsi="JetBrains Mono" w:cs="JetBrains Mono"/>
+                <w:b/>
+                <w:bCs/>
+                <w:color w:val="C23A00"/>
+                <w:sz w:val="14"/>
+                <w:szCs w:val="14"/>
+                <w:shd w:val="clear" w:color="auto" w:fill="FFE8E0"/>
+              </w:rPr>
+              <w:t xml:space="preserve"> DATA </w:t>
             </w:r>
             <w:r>
               <w:rPr>
@@ -2769,51 +2860,9 @@
           <w:szCs w:val="14"/>
           <w:shd w:val="clear" w:color="auto" w:fill="E2F2E7"/>
         </w:rPr>
-        <w:t xml:space="preserve"> VERIFIED </w:t>
-      </w:r>
-      <w:r>
-        <w:t xml:space="preserve"> Ads Manager → Conversions: data source "My first pixel" is set up, and one event, </w:t>
-      </w:r>
-      <w:r>
-        <w:rPr>
-          <w:b/>
-          <w:bCs/>
-        </w:rPr>
-        <w:t>"Form Submission" (lead_created)</w:t>
-      </w:r>
-      <w:r>
-        <w:t xml:space="preserve">, is defined. Setup checklist steps 3 ("Implement and log the event") and 4 ("Link event to a campaign") are </w:t>
-      </w:r>
-      <w:r>
-        <w:rPr>
-          <w:b/>
-          <w:bCs/>
-        </w:rPr>
-        <w:t>not done</w:t>
-      </w:r>
-      <w:r>
-        <w:t xml:space="preserve">. Total events: </w:t>
-      </w:r>
-      <w:r>
-        <w:rPr>
-          <w:b/>
-          <w:bCs/>
-        </w:rPr>
-        <w:t>0</w:t>
-      </w:r>
-      <w:r>
-        <w:t>.</w:t>
-      </w:r>
-    </w:p>
-    <w:p>
-      <w:pPr>
-        <w:pStyle w:val="ListParagraph"/>
-        <w:numPr>
-          <w:ilvl w:val="0"/>
-          <w:numId w:val="2"/>
-        </w:numPr>
-        <w:spacing w:after="70" w:line="290" w:lineRule="auto"/>
-      </w:pPr>
+        <w:t xml:space="preserve"> </w:t>
+      </w:r>
+      <w:proofErr w:type="gramStart"/>
       <w:r>
         <w:rPr>
           <w:rFonts w:ascii="JetBrains Mono" w:eastAsia="JetBrains Mono" w:hAnsi="JetBrains Mono" w:cs="JetBrains Mono"/>
@@ -2824,8 +2873,71 @@
           <w:szCs w:val="14"/>
           <w:shd w:val="clear" w:color="auto" w:fill="E2F2E7"/>
         </w:rPr>
-        <w:t xml:space="preserve"> VERI</w:t>
-      </w:r>
+        <w:t xml:space="preserve">VERIFIED </w:t>
+      </w:r>
+      <w:r>
+        <w:t xml:space="preserve"> Ads</w:t>
+      </w:r>
+      <w:proofErr w:type="gramEnd"/>
+      <w:r>
+        <w:t xml:space="preserve"> Manager → Conversions: data source "My first pixel" is set up, and one event, </w:t>
+      </w:r>
+      <w:r>
+        <w:rPr>
+          <w:b/>
+          <w:bCs/>
+        </w:rPr>
+        <w:t>"Form Submission" (</w:t>
+      </w:r>
+      <w:proofErr w:type="spellStart"/>
+      <w:r>
+        <w:rPr>
+          <w:b/>
+          <w:bCs/>
+        </w:rPr>
+        <w:t>lead_created</w:t>
+      </w:r>
+      <w:proofErr w:type="spellEnd"/>
+      <w:r>
+        <w:rPr>
+          <w:b/>
+          <w:bCs/>
+        </w:rPr>
+        <w:t>)</w:t>
+      </w:r>
+      <w:r>
+        <w:t xml:space="preserve">, is defined. Setup checklist steps 3 ("Implement and log the event") and 4 ("Link event to a campaign") are </w:t>
+      </w:r>
+      <w:r>
+        <w:rPr>
+          <w:b/>
+          <w:bCs/>
+        </w:rPr>
+        <w:t>not done</w:t>
+      </w:r>
+      <w:r>
+        <w:t xml:space="preserve">. Total events: </w:t>
+      </w:r>
+      <w:r>
+        <w:rPr>
+          <w:b/>
+          <w:bCs/>
+        </w:rPr>
+        <w:t>0</w:t>
+      </w:r>
+      <w:r>
+        <w:t>.</w:t>
+      </w:r>
+    </w:p>
+    <w:p>
+      <w:pPr>
+        <w:pStyle w:val="ListParagraph"/>
+        <w:numPr>
+          <w:ilvl w:val="0"/>
+          <w:numId w:val="2"/>
+        </w:numPr>
+        <w:spacing w:after="70" w:line="290" w:lineRule="auto"/>
+      </w:pPr>
       <w:r>
         <w:rPr>
           <w:rFonts w:ascii="JetBrains Mono" w:eastAsia="JetBrains Mono" w:hAnsi="JetBrains Mono" w:cs="JetBrains Mono"/>
@@ -2836,41 +2948,9 @@
           <w:szCs w:val="14"/>
           <w:shd w:val="clear" w:color="auto" w:fill="E2F2E7"/>
         </w:rPr>
-        <w:t xml:space="preserve">FIED </w:t>
-      </w:r>
-      <w:r>
-        <w:t xml:space="preserve"> Diagnostics shows 2 warnings: </w:t>
-      </w:r>
-      <w:r>
-        <w:rPr>
-          <w:i/>
-          <w:iCs/>
-        </w:rPr>
-        <w:t>no active campaigns use conversion events</w:t>
-      </w:r>
-      <w:r>
-        <w:t xml:space="preserve"> and </w:t>
-      </w:r>
-      <w:r>
-        <w:rPr>
-          <w:i/>
-          <w:iCs/>
-        </w:rPr>
-        <w:t>no recent server-to-server events</w:t>
-      </w:r>
-      <w:r>
-        <w:t>.</w:t>
-      </w:r>
-    </w:p>
-    <w:p>
-      <w:pPr>
-        <w:pStyle w:val="ListParagraph"/>
-        <w:numPr>
-          <w:ilvl w:val="0"/>
-          <w:numId w:val="2"/>
-        </w:numPr>
-        <w:spacing w:after="70" w:line="290" w:lineRule="auto"/>
-      </w:pPr>
+        <w:t xml:space="preserve"> </w:t>
+      </w:r>
+      <w:proofErr w:type="gramStart"/>
       <w:r>
         <w:rPr>
           <w:rFonts w:ascii="JetBrains Mono" w:eastAsia="JetBrains Mono" w:hAnsi="JetBrains Mono" w:cs="JetBrains Mono"/>
@@ -2881,22 +2961,34 @@
           <w:szCs w:val="14"/>
           <w:shd w:val="clear" w:color="auto" w:fill="E2F2E7"/>
         </w:rPr>
-        <w:t xml:space="preserve"> VERIFIED </w:t>
-      </w:r>
-      <w:r>
-        <w:t xml:space="preserve"> No OpenAI pixel or request loads on the landing page. GTM (</w:t>
-      </w:r>
-      <w:r>
-        <w:rPr>
-          <w:rFonts w:ascii="JetBrains Mono" w:eastAsia="JetBrains Mono" w:hAnsi="JetBrains Mono" w:cs="JetBrains Mono"/>
-          <w:color w:val="5E6166"/>
-          <w:sz w:val="17"/>
-          <w:szCs w:val="17"/>
-        </w:rPr>
-        <w:t>GTM-NZ5WRFG</w:t>
-      </w:r>
-      <w:r>
-        <w:t>) and Google Ads tags are present.</w:t>
+        <w:t xml:space="preserve">VERIFIED </w:t>
+      </w:r>
+      <w:r>
+        <w:t xml:space="preserve"> Diagnostics</w:t>
+      </w:r>
+      <w:proofErr w:type="gramEnd"/>
+      <w:r>
+        <w:t xml:space="preserve"> shows 2 warnings: </w:t>
+      </w:r>
+      <w:r>
+        <w:rPr>
+          <w:i/>
+          <w:iCs/>
+        </w:rPr>
+        <w:t>no active campaigns use conversion events</w:t>
+      </w:r>
+      <w:r>
+        <w:t xml:space="preserve"> and </w:t>
+      </w:r>
+      <w:r>
+        <w:rPr>
+          <w:i/>
+          <w:iCs/>
+        </w:rPr>
+        <w:t>no recent server-to-server events</w:t>
+      </w:r>
+      <w:r>
+        <w:t>.</w:t>
       </w:r>
     </w:p>
     <w:p>
@@ -2918,10 +3010,35 @@
           <w:szCs w:val="14"/>
           <w:shd w:val="clear" w:color="auto" w:fill="E2F2E7"/>
         </w:rPr>
-        <w:t xml:space="preserve"> VERIFIED </w:t>
-      </w:r>
-      <w:r>
-        <w:t xml:space="preserve"> Forms capture </w:t>
+        <w:t xml:space="preserve"> </w:t>
+      </w:r>
+      <w:proofErr w:type="gramStart"/>
+      <w:r>
+        <w:rPr>
+          <w:rFonts w:ascii="JetBrains Mono" w:eastAsia="JetBrains Mono" w:hAnsi="JetBrains Mono" w:cs="JetBrains Mono"/>
+          <w:b/>
+          <w:bCs/>
+          <w:color w:val="1E6B3A"/>
+          <w:sz w:val="14"/>
+          <w:szCs w:val="14"/>
+          <w:shd w:val="clear" w:color="auto" w:fill="E2F2E7"/>
+        </w:rPr>
+        <w:t xml:space="preserve">VERIFIED </w:t>
+      </w:r>
+      <w:r>
+        <w:t xml:space="preserve"> No</w:t>
+      </w:r>
+      <w:proofErr w:type="gramEnd"/>
+      <w:r>
+        <w:t xml:space="preserve"> </w:t>
+      </w:r>
+      <w:proofErr w:type="spellStart"/>
+      <w:r>
+        <w:t>OpenAI</w:t>
+      </w:r>
+      <w:proofErr w:type="spellEnd"/>
+      <w:r>
+        <w:t xml:space="preserve"> pixel or request loads on the landing page. GTM (</w:t>
       </w:r>
       <w:r>
         <w:rPr>
@@ -2930,11 +3047,54 @@
           <w:sz w:val="17"/>
           <w:szCs w:val="17"/>
         </w:rPr>
-        <w:t>utm_source/medium/campaign</w:t>
-      </w:r>
-      <w:r>
-        <w:t xml:space="preserve"> and </w:t>
-      </w:r>
+        <w:t>GTM-NZ5WRFG</w:t>
+      </w:r>
+      <w:r>
+        <w:t>) and Google Ads tags are present.</w:t>
+      </w:r>
+    </w:p>
+    <w:p>
+      <w:pPr>
+        <w:pStyle w:val="ListParagraph"/>
+        <w:numPr>
+          <w:ilvl w:val="0"/>
+          <w:numId w:val="2"/>
+        </w:numPr>
+        <w:spacing w:after="70" w:line="290" w:lineRule="auto"/>
+      </w:pPr>
+      <w:r>
+        <w:rPr>
+          <w:rFonts w:ascii="JetBrains Mono" w:eastAsia="JetBrains Mono" w:hAnsi="JetBrains Mono" w:cs="JetBrains Mono"/>
+          <w:b/>
+          <w:bCs/>
+          <w:color w:val="1E6B3A"/>
+          <w:sz w:val="14"/>
+          <w:szCs w:val="14"/>
+          <w:shd w:val="clear" w:color="auto" w:fill="E2F2E7"/>
+        </w:rPr>
+        <w:t xml:space="preserve"> </w:t>
+      </w:r>
+      <w:proofErr w:type="gramStart"/>
+      <w:r>
+        <w:rPr>
+          <w:rFonts w:ascii="JetBrains Mono" w:eastAsia="JetBrains Mono" w:hAnsi="JetBrains Mono" w:cs="JetBrains Mono"/>
+          <w:b/>
+          <w:bCs/>
+          <w:color w:val="1E6B3A"/>
+          <w:sz w:val="14"/>
+          <w:szCs w:val="14"/>
+          <w:shd w:val="clear" w:color="auto" w:fill="E2F2E7"/>
+        </w:rPr>
+        <w:t xml:space="preserve">VERIFIED </w:t>
+      </w:r>
+      <w:r>
+        <w:t xml:space="preserve"> Forms</w:t>
+      </w:r>
+      <w:proofErr w:type="gramEnd"/>
+      <w:r>
+        <w:t xml:space="preserve"> capture </w:t>
+      </w:r>
+      <w:proofErr w:type="spellStart"/>
       <w:r>
         <w:rPr>
           <w:rFonts w:ascii="JetBrains Mono" w:eastAsia="JetBrains Mono" w:hAnsi="JetBrains Mono" w:cs="JetBrains Mono"/>
@@ -2942,11 +3102,9 @@
           <w:sz w:val="17"/>
           <w:szCs w:val="17"/>
         </w:rPr>
-        <w:t>landing_page</w:t>
-      </w:r>
-      <w:r>
-        <w:t xml:space="preserve"> in hidden fields, and the values carry over to </w:t>
-      </w:r>
+        <w:t>utm_source</w:t>
+      </w:r>
+      <w:proofErr w:type="spellEnd"/>
       <w:r>
         <w:rPr>
           <w:rFonts w:ascii="JetBrains Mono" w:eastAsia="JetBrains Mono" w:hAnsi="JetBrains Mono" w:cs="JetBrains Mono"/>
@@ -2954,20 +3112,63 @@
           <w:sz w:val="17"/>
           <w:szCs w:val="17"/>
         </w:rPr>
+        <w:t>/medium/campaign</w:t>
+      </w:r>
+      <w:r>
+        <w:t xml:space="preserve"> and </w:t>
+      </w:r>
+      <w:proofErr w:type="spellStart"/>
+      <w:r>
+        <w:rPr>
+          <w:rFonts w:ascii="JetBrains Mono" w:eastAsia="JetBrains Mono" w:hAnsi="JetBrains Mono" w:cs="JetBrains Mono"/>
+          <w:color w:val="5E6166"/>
+          <w:sz w:val="17"/>
+          <w:szCs w:val="17"/>
+        </w:rPr>
+        <w:t>landing_page</w:t>
+      </w:r>
+      <w:proofErr w:type="spellEnd"/>
+      <w:r>
+        <w:t xml:space="preserve"> in hidden fields, and the values carry over to </w:t>
+      </w:r>
+      <w:r>
+        <w:rPr>
+          <w:rFonts w:ascii="JetBrains Mono" w:eastAsia="JetBrains Mono" w:hAnsi="JetBrains Mono" w:cs="JetBrains Mono"/>
+          <w:color w:val="5E6166"/>
+          <w:sz w:val="17"/>
+          <w:szCs w:val="17"/>
+        </w:rPr>
         <w:t>/contact</w:t>
       </w:r>
       <w:r>
         <w:t xml:space="preserve">. That's how the one lead was attributed. </w:t>
       </w:r>
+      <w:proofErr w:type="spellStart"/>
       <w:r>
         <w:rPr>
           <w:b/>
           <w:bCs/>
         </w:rPr>
-        <w:t>utm_content isn't captured</w:t>
-      </w:r>
-      <w:r>
-        <w:t>, so you can't tell which ad produced a lead.</w:t>
+        <w:t>utm_content</w:t>
+      </w:r>
+      <w:proofErr w:type="spellEnd"/>
+      <w:r>
+        <w:rPr>
+          <w:b/>
+          <w:bCs/>
+        </w:rPr>
+        <w:t xml:space="preserve"> isn't captured</w:t>
+      </w:r>
+      <w:r>
+        <w:t xml:space="preserve">, so you can't tell which </w:t>
+      </w:r>
+      <w:proofErr w:type="spellStart"/>
+      <w:r>
+        <w:t>ad</w:t>
+      </w:r>
+      <w:proofErr w:type="spellEnd"/>
+      <w:r>
+        <w:t xml:space="preserve"> produced a lead.</w:t>
       </w:r>
     </w:p>
     <w:p>
@@ -2989,13 +3190,27 @@
           <w:szCs w:val="14"/>
           <w:shd w:val="clear" w:color="auto" w:fill="E3EEF8"/>
         </w:rPr>
-        <w:t xml:space="preserve"> INFERRED </w:t>
-      </w:r>
-      <w:r>
-        <w:t xml:space="preserve"> With manual biddi</w:t>
-      </w:r>
-      <w:r>
-        <w:t>ng and no conversion signal, delivery has been tuned for clicks, not leads. A 0.77% CTR on 10.9k impressions suggests the targeting is broad.</w:t>
+        <w:t xml:space="preserve"> </w:t>
+      </w:r>
+      <w:proofErr w:type="gramStart"/>
+      <w:r>
+        <w:rPr>
+          <w:rFonts w:ascii="JetBrains Mono" w:eastAsia="JetBrains Mono" w:hAnsi="JetBrains Mono" w:cs="JetBrains Mono"/>
+          <w:b/>
+          <w:bCs/>
+          <w:color w:val="1F5A8A"/>
+          <w:sz w:val="14"/>
+          <w:szCs w:val="14"/>
+          <w:shd w:val="clear" w:color="auto" w:fill="E3EEF8"/>
+        </w:rPr>
+        <w:t xml:space="preserve">INFERRED </w:t>
+      </w:r>
+      <w:r>
+        <w:t xml:space="preserve"> With</w:t>
+      </w:r>
+      <w:proofErr w:type="gramEnd"/>
+      <w:r>
+        <w:t xml:space="preserve"> manual bidding and no conversion signal, delivery has been tuned for clicks, not leads. A 0.77% CTR on 10.9k impressions suggests the targeting is broad.</w:t>
       </w:r>
     </w:p>
     <w:p>
@@ -3017,10 +3232,35 @@
           <w:szCs w:val="14"/>
           <w:shd w:val="clear" w:color="auto" w:fill="FFE8E0"/>
         </w:rPr>
-        <w:t xml:space="preserve"> NEEDS DATA </w:t>
-      </w:r>
-      <w:r>
-        <w:t xml:space="preserve"> Whether Tawk chats and phone calls from ad traffic are logged as leads.</w:t>
+        <w:t xml:space="preserve"> NEEDS </w:t>
+      </w:r>
+      <w:proofErr w:type="gramStart"/>
+      <w:r>
+        <w:rPr>
+          <w:rFonts w:ascii="JetBrains Mono" w:eastAsia="JetBrains Mono" w:hAnsi="JetBrains Mono" w:cs="JetBrains Mono"/>
+          <w:b/>
+          <w:bCs/>
+          <w:color w:val="C23A00"/>
+          <w:sz w:val="14"/>
+          <w:szCs w:val="14"/>
+          <w:shd w:val="clear" w:color="auto" w:fill="FFE8E0"/>
+        </w:rPr>
+        <w:t xml:space="preserve">DATA </w:t>
+      </w:r>
+      <w:r>
+        <w:t xml:space="preserve"> Whether</w:t>
+      </w:r>
+      <w:proofErr w:type="gramEnd"/>
+      <w:r>
+        <w:t xml:space="preserve"> </w:t>
+      </w:r>
+      <w:proofErr w:type="spellStart"/>
+      <w:r>
+        <w:t>Tawk</w:t>
+      </w:r>
+      <w:proofErr w:type="spellEnd"/>
+      <w:r>
+        <w:t xml:space="preserve"> chats and phone calls from ad traffic are logged as leads.</w:t>
       </w:r>
     </w:p>
     <w:p>
@@ -3034,14 +3274,7 @@
           <w:rFonts w:ascii="Funnel Display" w:eastAsia="Funnel Display" w:hAnsi="Funnel Display" w:cs="Funnel Display"/>
           <w:color w:val="1D1E21"/>
         </w:rPr>
-        <w:t>2. Message match: the ad prom</w:t>
-      </w:r>
-      <w:r>
-        <w:rPr>
-          <w:rFonts w:ascii="Funnel Display" w:eastAsia="Funnel Display" w:hAnsi="Funnel Display" w:cs="Funnel Display"/>
-          <w:color w:val="1D1E21"/>
-        </w:rPr>
-        <w:t>ises AI operations, the page sells an app</w:t>
+        <w:t>2. Message match: the ad promises AI operations, the page sells an app</w:t>
       </w:r>
     </w:p>
     <w:tbl>
@@ -3288,6 +3521,7 @@
                 <w:sz w:val="18"/>
                 <w:szCs w:val="18"/>
               </w:rPr>
+              <w:lastRenderedPageBreak/>
               <w:t>Built for operators (clinic owners, home health, RCM leaders, per the targeting hints)</w:t>
             </w:r>
           </w:p>
@@ -3412,10 +3646,27 @@
           <w:szCs w:val="14"/>
           <w:shd w:val="clear" w:color="auto" w:fill="E2F2E7"/>
         </w:rPr>
-        <w:t xml:space="preserve"> VERIFIED </w:t>
-      </w:r>
-      <w:r>
-        <w:t xml:space="preserve"> The word "AI" doesn't appear in any section heading. The 6-step workflow is about launching a </w:t>
+        <w:t xml:space="preserve"> </w:t>
+      </w:r>
+      <w:proofErr w:type="gramStart"/>
+      <w:r>
+        <w:rPr>
+          <w:rFonts w:ascii="JetBrains Mono" w:eastAsia="JetBrains Mono" w:hAnsi="JetBrains Mono" w:cs="JetBrains Mono"/>
+          <w:b/>
+          <w:bCs/>
+          <w:color w:val="1E6B3A"/>
+          <w:sz w:val="14"/>
+          <w:szCs w:val="14"/>
+          <w:shd w:val="clear" w:color="auto" w:fill="E2F2E7"/>
+        </w:rPr>
+        <w:t xml:space="preserve">VERIFIED </w:t>
+      </w:r>
+      <w:r>
+        <w:t xml:space="preserve"> The</w:t>
+      </w:r>
+      <w:proofErr w:type="gramEnd"/>
+      <w:r>
+        <w:t xml:space="preserve"> word "AI" doesn't appear in any section heading. The 6-step workflow is about launching a </w:t>
       </w:r>
       <w:r>
         <w:rPr>
@@ -3447,13 +3698,43 @@
           <w:szCs w:val="14"/>
           <w:shd w:val="clear" w:color="auto" w:fill="E3EEF8"/>
         </w:rPr>
-        <w:t xml:space="preserve"> INFERRED </w:t>
-      </w:r>
-      <w:r>
-        <w:t xml:space="preserve"> A home health operator who clicked "automate admin work" sees "build your app" and leaves. On a ChatGPT click this matters even more: the user was mid-conversation about a specific problem and expects the page to continue that an</w:t>
-      </w:r>
-      <w:r>
-        <w:t>swer.</w:t>
+        <w:t xml:space="preserve"> </w:t>
+      </w:r>
+      <w:proofErr w:type="gramStart"/>
+      <w:r>
+        <w:rPr>
+          <w:rFonts w:ascii="JetBrains Mono" w:eastAsia="JetBrains Mono" w:hAnsi="JetBrains Mono" w:cs="JetBrains Mono"/>
+          <w:b/>
+          <w:bCs/>
+          <w:color w:val="1F5A8A"/>
+          <w:sz w:val="14"/>
+          <w:szCs w:val="14"/>
+          <w:shd w:val="clear" w:color="auto" w:fill="E3EEF8"/>
+        </w:rPr>
+        <w:t xml:space="preserve">INFERRED </w:t>
+      </w:r>
+      <w:r>
+        <w:t xml:space="preserve"> A</w:t>
+      </w:r>
+      <w:proofErr w:type="gramEnd"/>
+      <w:r>
+        <w:t xml:space="preserve"> home health operator who clicked "automate admin work" sees "build your app" and leaves. On a </w:t>
+      </w:r>
+      <w:proofErr w:type="spellStart"/>
+      <w:r>
+        <w:t>ChatGPT</w:t>
+      </w:r>
+      <w:proofErr w:type="spellEnd"/>
+      <w:r>
+        <w:t xml:space="preserve"> click </w:t>
+      </w:r>
+      <w:proofErr w:type="gramStart"/>
+      <w:r>
+        <w:t>this matters</w:t>
+      </w:r>
+      <w:proofErr w:type="gramEnd"/>
+      <w:r>
+        <w:t xml:space="preserve"> even more: the user was mid-conversation about a specific problem and expects the page to continue that answer.</w:t>
       </w:r>
     </w:p>
     <w:p>
@@ -3489,31 +3770,9 @@
           <w:szCs w:val="14"/>
           <w:shd w:val="clear" w:color="auto" w:fill="E2F2E7"/>
         </w:rPr>
-        <w:t xml:space="preserve"> VERIFIED </w:t>
-      </w:r>
-      <w:r>
-        <w:t xml:space="preserve"> The page is ~11,600 px tall. The only on-page form starts at ~10,240 px (</w:t>
-      </w:r>
-      <w:r>
-        <w:rPr>
-          <w:b/>
-          <w:bCs/>
-        </w:rPr>
-        <w:t>88% of the way down</w:t>
-      </w:r>
-      <w:r>
-        <w:t>).</w:t>
-      </w:r>
-    </w:p>
-    <w:p>
-      <w:pPr>
-        <w:pStyle w:val="ListParagraph"/>
-        <w:numPr>
-          <w:ilvl w:val="0"/>
-          <w:numId w:val="2"/>
-        </w:numPr>
-        <w:spacing w:after="70" w:line="290" w:lineRule="auto"/>
-      </w:pPr>
+        <w:t xml:space="preserve"> </w:t>
+      </w:r>
+      <w:proofErr w:type="gramStart"/>
       <w:r>
         <w:rPr>
           <w:rFonts w:ascii="JetBrains Mono" w:eastAsia="JetBrains Mono" w:hAnsi="JetBrains Mono" w:cs="JetBrains Mono"/>
@@ -3524,25 +3783,32 @@
           <w:szCs w:val="14"/>
           <w:shd w:val="clear" w:color="auto" w:fill="E2F2E7"/>
         </w:rPr>
-        <w:t xml:space="preserve"> VERIFIED </w:t>
-      </w:r>
-      <w:r>
-        <w:t xml:space="preserve"> 9 CTAs use 6 different labels ("Let's Build Your App!", "Let's Build Your</w:t>
-      </w:r>
-      <w:r>
-        <w:t xml:space="preserve"> Project Now!", "Let's Build", "Book A Free Consultation Now!", "Let's Connect!", "Get A Quote"). All of them leave the page for the generic </w:t>
-      </w:r>
-      <w:r>
-        <w:rPr>
-          <w:rFonts w:ascii="JetBrains Mono" w:eastAsia="JetBrains Mono" w:hAnsi="JetBrains Mono" w:cs="JetBrains Mono"/>
-          <w:color w:val="5E6166"/>
-          <w:sz w:val="17"/>
-          <w:szCs w:val="17"/>
-        </w:rPr>
-        <w:t>/contact</w:t>
-      </w:r>
-      <w:r>
-        <w:t>.</w:t>
+        <w:t xml:space="preserve">VERIFIED </w:t>
+      </w:r>
+      <w:r>
+        <w:t xml:space="preserve"> The</w:t>
+      </w:r>
+      <w:proofErr w:type="gramEnd"/>
+      <w:r>
+        <w:t xml:space="preserve"> page is ~11,600 px tall. The only </w:t>
+      </w:r>
+      <w:proofErr w:type="spellStart"/>
+      <w:r>
+        <w:t>on</w:t>
+      </w:r>
+      <w:proofErr w:type="spellEnd"/>
+      <w:r>
+        <w:t>-page form starts at ~10,240 px (</w:t>
+      </w:r>
+      <w:r>
+        <w:rPr>
+          <w:b/>
+          <w:bCs/>
+        </w:rPr>
+        <w:t>88% of the way down</w:t>
+      </w:r>
+      <w:r>
+        <w:t>).</w:t>
       </w:r>
     </w:p>
     <w:p>
@@ -3567,7 +3833,7 @@
         <w:t xml:space="preserve"> VERIFIED </w:t>
       </w:r>
       <w:r>
-        <w:t xml:space="preserve"> </w:t>
+        <w:t xml:space="preserve"> 9 CTAs use 6 different labels ("Let's Build Your App!", "Let's Build Your Project Now!", "Let's Build", "Book A Free Consultation Now!", "Let's Connect!", "Get A Quote"). All of them leave the page for the generic </w:t>
       </w:r>
       <w:r>
         <w:rPr>
@@ -3579,30 +3845,7 @@
         <w:t>/contact</w:t>
       </w:r>
       <w:r>
-        <w:t xml:space="preserve"> says "Let's start a project together", which drops the healthcare context. It require</w:t>
-      </w:r>
-      <w:r>
-        <w:t xml:space="preserve">s name, email, </w:t>
-      </w:r>
-      <w:r>
-        <w:rPr>
-          <w:b/>
-          <w:bCs/>
-        </w:rPr>
-        <w:t>phone</w:t>
-      </w:r>
-      <w:r>
-        <w:t xml:space="preserve"> and project description, and shows a </w:t>
-      </w:r>
-      <w:r>
-        <w:rPr>
-          <w:b/>
-          <w:bCs/>
-        </w:rPr>
-        <w:t>visible reCAPTCHA checkbox</w:t>
-      </w:r>
-      <w:r>
-        <w:t>. The pop-up version adds project type, service and a budget dropdown starting at "Under $5000".</w:t>
+        <w:t>.</w:t>
       </w:r>
     </w:p>
     <w:p>
@@ -3624,10 +3867,123 @@
           <w:szCs w:val="14"/>
           <w:shd w:val="clear" w:color="auto" w:fill="E2F2E7"/>
         </w:rPr>
-        <w:t xml:space="preserve"> VERIFIED </w:t>
-      </w:r>
-      <w:r>
-        <w:t xml:space="preserve"> Full top navigation, a blog block (Flutter "top 10" lists), an industries grid (music, entertainment, real estate) and a tech stack (.NET, Angular) all compete with the CTA.</w:t>
+        <w:t xml:space="preserve"> </w:t>
+      </w:r>
+      <w:proofErr w:type="gramStart"/>
+      <w:r>
+        <w:rPr>
+          <w:rFonts w:ascii="JetBrains Mono" w:eastAsia="JetBrains Mono" w:hAnsi="JetBrains Mono" w:cs="JetBrains Mono"/>
+          <w:b/>
+          <w:bCs/>
+          <w:color w:val="1E6B3A"/>
+          <w:sz w:val="14"/>
+          <w:szCs w:val="14"/>
+          <w:shd w:val="clear" w:color="auto" w:fill="E2F2E7"/>
+        </w:rPr>
+        <w:t xml:space="preserve">VERIFIED </w:t>
+      </w:r>
+      <w:r>
+        <w:t xml:space="preserve"> </w:t>
+      </w:r>
+      <w:r>
+        <w:rPr>
+          <w:rFonts w:ascii="JetBrains Mono" w:eastAsia="JetBrains Mono" w:hAnsi="JetBrains Mono" w:cs="JetBrains Mono"/>
+          <w:color w:val="5E6166"/>
+          <w:sz w:val="17"/>
+          <w:szCs w:val="17"/>
+        </w:rPr>
+        <w:t>/</w:t>
+      </w:r>
+      <w:proofErr w:type="gramEnd"/>
+      <w:r>
+        <w:rPr>
+          <w:rFonts w:ascii="JetBrains Mono" w:eastAsia="JetBrains Mono" w:hAnsi="JetBrains Mono" w:cs="JetBrains Mono"/>
+          <w:color w:val="5E6166"/>
+          <w:sz w:val="17"/>
+          <w:szCs w:val="17"/>
+        </w:rPr>
+        <w:t>contact</w:t>
+      </w:r>
+      <w:r>
+        <w:t xml:space="preserve"> says "Let's start a project together", which drops the healthcare context. It requires name, email, </w:t>
+      </w:r>
+      <w:r>
+        <w:rPr>
+          <w:b/>
+          <w:bCs/>
+        </w:rPr>
+        <w:t>phone</w:t>
+      </w:r>
+      <w:r>
+        <w:t xml:space="preserve"> and project description, and shows a </w:t>
+      </w:r>
+      <w:r>
+        <w:rPr>
+          <w:b/>
+          <w:bCs/>
+        </w:rPr>
+        <w:t xml:space="preserve">visible </w:t>
+      </w:r>
+      <w:proofErr w:type="spellStart"/>
+      <w:r>
+        <w:rPr>
+          <w:b/>
+          <w:bCs/>
+        </w:rPr>
+        <w:t>reCAPTCHA</w:t>
+      </w:r>
+      <w:proofErr w:type="spellEnd"/>
+      <w:r>
+        <w:rPr>
+          <w:b/>
+          <w:bCs/>
+        </w:rPr>
+        <w:t xml:space="preserve"> checkbox</w:t>
+      </w:r>
+      <w:r>
+        <w:t>. The pop-up version adds project type, service and a budget dropdown starting at "Under $5000".</w:t>
+      </w:r>
+    </w:p>
+    <w:p>
+      <w:pPr>
+        <w:pStyle w:val="ListParagraph"/>
+        <w:numPr>
+          <w:ilvl w:val="0"/>
+          <w:numId w:val="2"/>
+        </w:numPr>
+        <w:spacing w:after="70" w:line="290" w:lineRule="auto"/>
+      </w:pPr>
+      <w:r>
+        <w:rPr>
+          <w:rFonts w:ascii="JetBrains Mono" w:eastAsia="JetBrains Mono" w:hAnsi="JetBrains Mono" w:cs="JetBrains Mono"/>
+          <w:b/>
+          <w:bCs/>
+          <w:color w:val="1E6B3A"/>
+          <w:sz w:val="14"/>
+          <w:szCs w:val="14"/>
+          <w:shd w:val="clear" w:color="auto" w:fill="E2F2E7"/>
+        </w:rPr>
+        <w:t xml:space="preserve"> </w:t>
+      </w:r>
+      <w:proofErr w:type="gramStart"/>
+      <w:r>
+        <w:rPr>
+          <w:rFonts w:ascii="JetBrains Mono" w:eastAsia="JetBrains Mono" w:hAnsi="JetBrains Mono" w:cs="JetBrains Mono"/>
+          <w:b/>
+          <w:bCs/>
+          <w:color w:val="1E6B3A"/>
+          <w:sz w:val="14"/>
+          <w:szCs w:val="14"/>
+          <w:shd w:val="clear" w:color="auto" w:fill="E2F2E7"/>
+        </w:rPr>
+        <w:t xml:space="preserve">VERIFIED </w:t>
+      </w:r>
+      <w:r>
+        <w:t xml:space="preserve"> Full</w:t>
+      </w:r>
+      <w:proofErr w:type="gramEnd"/>
+      <w:r>
+        <w:t xml:space="preserve"> top navigation, a blog block (Flutter "top 10" lists), an industries grid (music, entertainment, real estate) and a tech stack (.NET, Angular) all compete with the CTA.</w:t>
       </w:r>
     </w:p>
     <w:p>
@@ -3649,13 +4005,35 @@
           <w:szCs w:val="14"/>
           <w:shd w:val="clear" w:color="auto" w:fill="E3EEF8"/>
         </w:rPr>
-        <w:t xml:space="preserve"> INFERRED </w:t>
-      </w:r>
-      <w:r>
-        <w:t xml:space="preserve"> There's no low-commitment offer. Every CTA asks for a sales conversati</w:t>
-      </w:r>
-      <w:r>
-        <w:t>on or a quote, which is a big ask from someone who was just researching in ChatGPT.</w:t>
+        <w:t xml:space="preserve"> </w:t>
+      </w:r>
+      <w:proofErr w:type="gramStart"/>
+      <w:r>
+        <w:rPr>
+          <w:rFonts w:ascii="JetBrains Mono" w:eastAsia="JetBrains Mono" w:hAnsi="JetBrains Mono" w:cs="JetBrains Mono"/>
+          <w:b/>
+          <w:bCs/>
+          <w:color w:val="1F5A8A"/>
+          <w:sz w:val="14"/>
+          <w:szCs w:val="14"/>
+          <w:shd w:val="clear" w:color="auto" w:fill="E3EEF8"/>
+        </w:rPr>
+        <w:t xml:space="preserve">INFERRED </w:t>
+      </w:r>
+      <w:r>
+        <w:t xml:space="preserve"> There's</w:t>
+      </w:r>
+      <w:proofErr w:type="gramEnd"/>
+      <w:r>
+        <w:t xml:space="preserve"> no low-commitment offer. Every CTA asks for a sales conversation or a quote, which is a big ask from someone who was just researching in </w:t>
+      </w:r>
+      <w:proofErr w:type="spellStart"/>
+      <w:r>
+        <w:t>ChatGPT</w:t>
+      </w:r>
+      <w:proofErr w:type="spellEnd"/>
+      <w:r>
+        <w:t>.</w:t>
       </w:r>
     </w:p>
     <w:p>
@@ -3691,24 +4069,9 @@
           <w:szCs w:val="14"/>
           <w:shd w:val="clear" w:color="auto" w:fill="E2F2E7"/>
         </w:rPr>
-        <w:t xml:space="preserve"> VERIFIED </w:t>
-      </w:r>
-      <w:r>
-        <w:t xml:space="preserve"> All 3 testimonials are from non-healthcare clients (education nonprofit, community nonprofit,</w:t>
-      </w:r>
-      <w:r>
-        <w:t xml:space="preserve"> a startup), and each is shown twice.</w:t>
-      </w:r>
-    </w:p>
-    <w:p>
-      <w:pPr>
-        <w:pStyle w:val="ListParagraph"/>
-        <w:numPr>
-          <w:ilvl w:val="0"/>
-          <w:numId w:val="2"/>
-        </w:numPr>
-        <w:spacing w:after="70" w:line="290" w:lineRule="auto"/>
-      </w:pPr>
+        <w:t xml:space="preserve"> </w:t>
+      </w:r>
+      <w:proofErr w:type="gramStart"/>
       <w:r>
         <w:rPr>
           <w:rFonts w:ascii="JetBrains Mono" w:eastAsia="JetBrains Mono" w:hAnsi="JetBrains Mono" w:cs="JetBrains Mono"/>
@@ -3719,30 +4082,14 @@
           <w:szCs w:val="14"/>
           <w:shd w:val="clear" w:color="auto" w:fill="E2F2E7"/>
         </w:rPr>
-        <w:t xml:space="preserve"> VERIFIED </w:t>
-      </w:r>
-      <w:r>
-        <w:t xml:space="preserve"> The stats say "</w:t>
-      </w:r>
-      <w:r>
-        <w:rPr>
-          <w:b/>
-          <w:bCs/>
-        </w:rPr>
-        <w:t>100+</w:t>
-      </w:r>
-      <w:r>
-        <w:t xml:space="preserve"> Mobile Apps Developed", but the approved claim is </w:t>
-      </w:r>
-      <w:r>
-        <w:rPr>
-          <w:b/>
-          <w:bCs/>
-        </w:rPr>
-        <w:t>800+</w:t>
-      </w:r>
-      <w:r>
-        <w:t xml:space="preserve"> apps/products. "Top Entertainment App Developers" sits in the awards list on a healthcare page.</w:t>
+        <w:t xml:space="preserve">VERIFIED </w:t>
+      </w:r>
+      <w:r>
+        <w:t xml:space="preserve"> All</w:t>
+      </w:r>
+      <w:proofErr w:type="gramEnd"/>
+      <w:r>
+        <w:t xml:space="preserve"> 3 testimonials are from non-healthcare clients (education nonprofit, community nonprofit, a startup), and each is shown twice.</w:t>
       </w:r>
     </w:p>
     <w:p>
@@ -3764,24 +4111,9 @@
           <w:szCs w:val="14"/>
           <w:shd w:val="clear" w:color="auto" w:fill="E2F2E7"/>
         </w:rPr>
-        <w:t xml:space="preserve"> VERIFIED </w:t>
-      </w:r>
-      <w:r>
-        <w:t xml:space="preserve"> There are 3 healthcare ca</w:t>
-      </w:r>
-      <w:r>
-        <w:t>se studies (MiloCare, Nurse Practitioners, Stop Vaping). They show only a one-line teaser, with no problem, no outcome and no numbers.</w:t>
-      </w:r>
-    </w:p>
-    <w:p>
-      <w:pPr>
-        <w:pStyle w:val="ListParagraph"/>
-        <w:numPr>
-          <w:ilvl w:val="0"/>
-          <w:numId w:val="2"/>
-        </w:numPr>
-        <w:spacing w:after="70" w:line="290" w:lineRule="auto"/>
-      </w:pPr>
+        <w:t xml:space="preserve"> </w:t>
+      </w:r>
+      <w:proofErr w:type="gramStart"/>
       <w:r>
         <w:rPr>
           <w:rFonts w:ascii="JetBrains Mono" w:eastAsia="JetBrains Mono" w:hAnsi="JetBrains Mono" w:cs="JetBrains Mono"/>
@@ -3792,13 +4124,34 @@
           <w:szCs w:val="14"/>
           <w:shd w:val="clear" w:color="auto" w:fill="E2F2E7"/>
         </w:rPr>
-        <w:t xml:space="preserve"> VERIFIED </w:t>
-      </w:r>
-      <w:r>
-        <w:t xml:space="preserve"> Copy quality: "Web Excelllence" typo. The "Expertise &amp; Experience" and "Communication" bullets use the same te</w:t>
-      </w:r>
-      <w:r>
-        <w:t>xt. "We cautiously build solutions" is a word-choice slip.</w:t>
+        <w:t xml:space="preserve">VERIFIED </w:t>
+      </w:r>
+      <w:r>
+        <w:t xml:space="preserve"> The</w:t>
+      </w:r>
+      <w:proofErr w:type="gramEnd"/>
+      <w:r>
+        <w:t xml:space="preserve"> stats say "</w:t>
+      </w:r>
+      <w:r>
+        <w:rPr>
+          <w:b/>
+          <w:bCs/>
+        </w:rPr>
+        <w:t>100+</w:t>
+      </w:r>
+      <w:r>
+        <w:t xml:space="preserve"> Mobile Apps Developed", but the approved claim is </w:t>
+      </w:r>
+      <w:r>
+        <w:rPr>
+          <w:b/>
+          <w:bCs/>
+        </w:rPr>
+        <w:t>800+</w:t>
+      </w:r>
+      <w:r>
+        <w:t xml:space="preserve"> apps/products. "Top Entertainment App Developers" sits in the awards list on a healthcare page.</w:t>
       </w:r>
     </w:p>
     <w:p>
@@ -3820,13 +4173,127 @@
           <w:szCs w:val="14"/>
           <w:shd w:val="clear" w:color="auto" w:fill="E2F2E7"/>
         </w:rPr>
-        <w:t xml:space="preserve"> VERIFIED </w:t>
-      </w:r>
-      <w:r>
-        <w:t xml:space="preserve"> HIPAA appears only twice in body copy and once in the FAQ. There's no compliance block for the approver (BAA, PHI handling, private LLMs with PII redaction), even though these are approv</w:t>
-      </w:r>
-      <w:r>
-        <w:t>ed claims.</w:t>
+        <w:t xml:space="preserve"> </w:t>
+      </w:r>
+      <w:proofErr w:type="gramStart"/>
+      <w:r>
+        <w:rPr>
+          <w:rFonts w:ascii="JetBrains Mono" w:eastAsia="JetBrains Mono" w:hAnsi="JetBrains Mono" w:cs="JetBrains Mono"/>
+          <w:b/>
+          <w:bCs/>
+          <w:color w:val="1E6B3A"/>
+          <w:sz w:val="14"/>
+          <w:szCs w:val="14"/>
+          <w:shd w:val="clear" w:color="auto" w:fill="E2F2E7"/>
+        </w:rPr>
+        <w:t xml:space="preserve">VERIFIED </w:t>
+      </w:r>
+      <w:r>
+        <w:t xml:space="preserve"> There</w:t>
+      </w:r>
+      <w:proofErr w:type="gramEnd"/>
+      <w:r>
+        <w:t xml:space="preserve"> are 3 healthcare case studies (</w:t>
+      </w:r>
+      <w:proofErr w:type="spellStart"/>
+      <w:r>
+        <w:t>MiloCare</w:t>
+      </w:r>
+      <w:proofErr w:type="spellEnd"/>
+      <w:r>
+        <w:t>, Nurse Practitioners, Stop Vaping). They show only a one-line teaser, with no problem, no outcome and no numbers.</w:t>
+      </w:r>
+    </w:p>
+    <w:p>
+      <w:pPr>
+        <w:pStyle w:val="ListParagraph"/>
+        <w:numPr>
+          <w:ilvl w:val="0"/>
+          <w:numId w:val="2"/>
+        </w:numPr>
+        <w:spacing w:after="70" w:line="290" w:lineRule="auto"/>
+      </w:pPr>
+      <w:r>
+        <w:rPr>
+          <w:rFonts w:ascii="JetBrains Mono" w:eastAsia="JetBrains Mono" w:hAnsi="JetBrains Mono" w:cs="JetBrains Mono"/>
+          <w:b/>
+          <w:bCs/>
+          <w:color w:val="1E6B3A"/>
+          <w:sz w:val="14"/>
+          <w:szCs w:val="14"/>
+          <w:shd w:val="clear" w:color="auto" w:fill="E2F2E7"/>
+        </w:rPr>
+        <w:t xml:space="preserve"> </w:t>
+      </w:r>
+      <w:proofErr w:type="gramStart"/>
+      <w:r>
+        <w:rPr>
+          <w:rFonts w:ascii="JetBrains Mono" w:eastAsia="JetBrains Mono" w:hAnsi="JetBrains Mono" w:cs="JetBrains Mono"/>
+          <w:b/>
+          <w:bCs/>
+          <w:color w:val="1E6B3A"/>
+          <w:sz w:val="14"/>
+          <w:szCs w:val="14"/>
+          <w:shd w:val="clear" w:color="auto" w:fill="E2F2E7"/>
+        </w:rPr>
+        <w:t xml:space="preserve">VERIFIED </w:t>
+      </w:r>
+      <w:r>
+        <w:t xml:space="preserve"> Copy</w:t>
+      </w:r>
+      <w:proofErr w:type="gramEnd"/>
+      <w:r>
+        <w:t xml:space="preserve"> quality: "Web </w:t>
+      </w:r>
+      <w:proofErr w:type="spellStart"/>
+      <w:r>
+        <w:t>Excelllence</w:t>
+      </w:r>
+      <w:proofErr w:type="spellEnd"/>
+      <w:r>
+        <w:t>" typo. The "Expertise &amp; Experience" and "Communication" bullets use the same text. "We cautiously build solutions" is a word-choice slip.</w:t>
+      </w:r>
+    </w:p>
+    <w:p>
+      <w:pPr>
+        <w:pStyle w:val="ListParagraph"/>
+        <w:numPr>
+          <w:ilvl w:val="0"/>
+          <w:numId w:val="2"/>
+        </w:numPr>
+        <w:spacing w:after="70" w:line="290" w:lineRule="auto"/>
+      </w:pPr>
+      <w:r>
+        <w:rPr>
+          <w:rFonts w:ascii="JetBrains Mono" w:eastAsia="JetBrains Mono" w:hAnsi="JetBrains Mono" w:cs="JetBrains Mono"/>
+          <w:b/>
+          <w:bCs/>
+          <w:color w:val="1E6B3A"/>
+          <w:sz w:val="14"/>
+          <w:szCs w:val="14"/>
+          <w:shd w:val="clear" w:color="auto" w:fill="E2F2E7"/>
+        </w:rPr>
+        <w:t xml:space="preserve"> </w:t>
+      </w:r>
+      <w:proofErr w:type="gramStart"/>
+      <w:r>
+        <w:rPr>
+          <w:rFonts w:ascii="JetBrains Mono" w:eastAsia="JetBrains Mono" w:hAnsi="JetBrains Mono" w:cs="JetBrains Mono"/>
+          <w:b/>
+          <w:bCs/>
+          <w:color w:val="1E6B3A"/>
+          <w:sz w:val="14"/>
+          <w:szCs w:val="14"/>
+          <w:shd w:val="clear" w:color="auto" w:fill="E2F2E7"/>
+        </w:rPr>
+        <w:t xml:space="preserve">VERIFIED </w:t>
+      </w:r>
+      <w:r>
+        <w:t xml:space="preserve"> HIPAA</w:t>
+      </w:r>
+      <w:proofErr w:type="gramEnd"/>
+      <w:r>
+        <w:t xml:space="preserve"> appears only twice in body copy and once in the FAQ. There's no compliance block for the approver (BAA, PHI handling, private LLMs with PII redaction), even though these are approved claims.</w:t>
       </w:r>
     </w:p>
     <w:p>
@@ -3840,6 +4307,7 @@
           <w:rFonts w:ascii="Funnel Display" w:eastAsia="Funnel Display" w:hAnsi="Funnel Display" w:cs="Funnel Display"/>
           <w:color w:val="1D1E21"/>
         </w:rPr>
+        <w:lastRenderedPageBreak/>
         <w:t>5. Lead quality and close</w:t>
       </w:r>
     </w:p>
@@ -3862,10 +4330,27 @@
           <w:szCs w:val="14"/>
           <w:shd w:val="clear" w:color="auto" w:fill="FFE8E0"/>
         </w:rPr>
-        <w:t xml:space="preserve"> NEEDS DATA </w:t>
-      </w:r>
-      <w:r>
-        <w:t xml:space="preserve"> We don't know who the one lead was, what they asked for, how fast sales replied, or why it didn't close. This decides whether to qualify harder or softer.</w:t>
+        <w:t xml:space="preserve"> NEEDS </w:t>
+      </w:r>
+      <w:proofErr w:type="gramStart"/>
+      <w:r>
+        <w:rPr>
+          <w:rFonts w:ascii="JetBrains Mono" w:eastAsia="JetBrains Mono" w:hAnsi="JetBrains Mono" w:cs="JetBrains Mono"/>
+          <w:b/>
+          <w:bCs/>
+          <w:color w:val="C23A00"/>
+          <w:sz w:val="14"/>
+          <w:szCs w:val="14"/>
+          <w:shd w:val="clear" w:color="auto" w:fill="FFE8E0"/>
+        </w:rPr>
+        <w:t xml:space="preserve">DATA </w:t>
+      </w:r>
+      <w:r>
+        <w:t xml:space="preserve"> We</w:t>
+      </w:r>
+      <w:proofErr w:type="gramEnd"/>
+      <w:r>
+        <w:t xml:space="preserve"> don't know who the one lead was, what they asked for, how fast sales replied, or why it didn't close. This decides whether to qualify harder or softer.</w:t>
       </w:r>
     </w:p>
     <w:p>
@@ -3887,13 +4372,27 @@
           <w:szCs w:val="14"/>
           <w:shd w:val="clear" w:color="auto" w:fill="E3EEF8"/>
         </w:rPr>
-        <w:t xml:space="preserve"> INFERRED </w:t>
-      </w:r>
-      <w:r>
-        <w:t xml:space="preserve"> The current form doesn't ask what kind o</w:t>
-      </w:r>
-      <w:r>
-        <w:t>f organization the lead is or what workflow hurts, so sales starts the first call cold and has to rediscover the problem.</w:t>
+        <w:t xml:space="preserve"> </w:t>
+      </w:r>
+      <w:proofErr w:type="gramStart"/>
+      <w:r>
+        <w:rPr>
+          <w:rFonts w:ascii="JetBrains Mono" w:eastAsia="JetBrains Mono" w:hAnsi="JetBrains Mono" w:cs="JetBrains Mono"/>
+          <w:b/>
+          <w:bCs/>
+          <w:color w:val="1F5A8A"/>
+          <w:sz w:val="14"/>
+          <w:szCs w:val="14"/>
+          <w:shd w:val="clear" w:color="auto" w:fill="E3EEF8"/>
+        </w:rPr>
+        <w:t xml:space="preserve">INFERRED </w:t>
+      </w:r>
+      <w:r>
+        <w:t xml:space="preserve"> The</w:t>
+      </w:r>
+      <w:proofErr w:type="gramEnd"/>
+      <w:r>
+        <w:t xml:space="preserve"> current form doesn't ask what kind of organization the lead is or what workflow hurts, so sales starts the first call cold and has to rediscover the problem.</w:t>
       </w:r>
     </w:p>
     <w:p>
@@ -3929,24 +4428,9 @@
           <w:szCs w:val="14"/>
           <w:shd w:val="clear" w:color="auto" w:fill="FFE8E0"/>
         </w:rPr>
-        <w:t xml:space="preserve"> NEEDS DATA </w:t>
-      </w:r>
-      <w:r>
-        <w:t xml:space="preserve"> Mobile layout and Core Web Vitals: the PageSpeed API hit its daily quota. Desktop load in Sana's browser w</w:t>
-      </w:r>
-      <w:r>
-        <w:t>as ~2.1 s. Rerun tomorrow, since most ChatGPT clicks are likely on mobile.</w:t>
-      </w:r>
-    </w:p>
-    <w:p>
-      <w:pPr>
-        <w:pStyle w:val="ListParagraph"/>
-        <w:numPr>
-          <w:ilvl w:val="0"/>
-          <w:numId w:val="2"/>
-        </w:numPr>
-        <w:spacing w:after="70" w:line="290" w:lineRule="auto"/>
-      </w:pPr>
+        <w:t xml:space="preserve"> NEEDS </w:t>
+      </w:r>
+      <w:proofErr w:type="gramStart"/>
       <w:r>
         <w:rPr>
           <w:rFonts w:ascii="JetBrains Mono" w:eastAsia="JetBrains Mono" w:hAnsi="JetBrains Mono" w:cs="JetBrains Mono"/>
@@ -3957,11 +4441,74 @@
           <w:szCs w:val="14"/>
           <w:shd w:val="clear" w:color="auto" w:fill="FFE8E0"/>
         </w:rPr>
-        <w:t xml:space="preserve"> NEEDS DATA </w:t>
-      </w:r>
-      <w:r>
-        <w:t xml:space="preserve"> GA4 for this traffic (bounce/engagement for </w:t>
-      </w:r>
+        <w:t xml:space="preserve">DATA </w:t>
+      </w:r>
+      <w:r>
+        <w:t xml:space="preserve"> Mobile</w:t>
+      </w:r>
+      <w:proofErr w:type="gramEnd"/>
+      <w:r>
+        <w:t xml:space="preserve"> layout and Core Web Vitals: the </w:t>
+      </w:r>
+      <w:proofErr w:type="spellStart"/>
+      <w:r>
+        <w:t>PageSpeed</w:t>
+      </w:r>
+      <w:proofErr w:type="spellEnd"/>
+      <w:r>
+        <w:t xml:space="preserve"> API hit its daily quota. Desktop load in Sana's browser was ~2.1 s. Rerun tomorrow, since most </w:t>
+      </w:r>
+      <w:proofErr w:type="spellStart"/>
+      <w:r>
+        <w:t>ChatGPT</w:t>
+      </w:r>
+      <w:proofErr w:type="spellEnd"/>
+      <w:r>
+        <w:t xml:space="preserve"> clicks are likely on mobile.</w:t>
+      </w:r>
+    </w:p>
+    <w:p>
+      <w:pPr>
+        <w:pStyle w:val="ListParagraph"/>
+        <w:numPr>
+          <w:ilvl w:val="0"/>
+          <w:numId w:val="2"/>
+        </w:numPr>
+        <w:spacing w:after="70" w:line="290" w:lineRule="auto"/>
+      </w:pPr>
+      <w:r>
+        <w:rPr>
+          <w:rFonts w:ascii="JetBrains Mono" w:eastAsia="JetBrains Mono" w:hAnsi="JetBrains Mono" w:cs="JetBrains Mono"/>
+          <w:b/>
+          <w:bCs/>
+          <w:color w:val="C23A00"/>
+          <w:sz w:val="14"/>
+          <w:szCs w:val="14"/>
+          <w:shd w:val="clear" w:color="auto" w:fill="FFE8E0"/>
+        </w:rPr>
+        <w:t xml:space="preserve"> NEEDS </w:t>
+      </w:r>
+      <w:proofErr w:type="gramStart"/>
+      <w:r>
+        <w:rPr>
+          <w:rFonts w:ascii="JetBrains Mono" w:eastAsia="JetBrains Mono" w:hAnsi="JetBrains Mono" w:cs="JetBrains Mono"/>
+          <w:b/>
+          <w:bCs/>
+          <w:color w:val="C23A00"/>
+          <w:sz w:val="14"/>
+          <w:szCs w:val="14"/>
+          <w:shd w:val="clear" w:color="auto" w:fill="FFE8E0"/>
+        </w:rPr>
+        <w:t xml:space="preserve">DATA </w:t>
+      </w:r>
+      <w:r>
+        <w:t xml:space="preserve"> GA</w:t>
+      </w:r>
+      <w:proofErr w:type="gramEnd"/>
+      <w:r>
+        <w:t xml:space="preserve">4 for this traffic (bounce/engagement for </w:t>
+      </w:r>
+      <w:proofErr w:type="spellStart"/>
       <w:r>
         <w:rPr>
           <w:rFonts w:ascii="JetBrains Mono" w:eastAsia="JetBrains Mono" w:hAnsi="JetBrains Mono" w:cs="JetBrains Mono"/>
@@ -3969,8 +4516,29 @@
           <w:sz w:val="17"/>
           <w:szCs w:val="17"/>
         </w:rPr>
-        <w:t>utm_source=chatgpt</w:t>
-      </w:r>
+        <w:t>utm_source</w:t>
+      </w:r>
+      <w:proofErr w:type="spellEnd"/>
+      <w:r>
+        <w:rPr>
+          <w:rFonts w:ascii="JetBrains Mono" w:eastAsia="JetBrains Mono" w:hAnsi="JetBrains Mono" w:cs="JetBrains Mono"/>
+          <w:color w:val="5E6166"/>
+          <w:sz w:val="17"/>
+          <w:szCs w:val="17"/>
+        </w:rPr>
+        <w:t>=</w:t>
+      </w:r>
+      <w:proofErr w:type="spellStart"/>
+      <w:r>
+        <w:rPr>
+          <w:rFonts w:ascii="JetBrains Mono" w:eastAsia="JetBrains Mono" w:hAnsi="JetBrains Mono" w:cs="JetBrains Mono"/>
+          <w:color w:val="5E6166"/>
+          <w:sz w:val="17"/>
+          <w:szCs w:val="17"/>
+        </w:rPr>
+        <w:t>chatgpt</w:t>
+      </w:r>
+      <w:proofErr w:type="spellEnd"/>
       <w:r>
         <w:t>, scroll depth). I had no access in this pass.</w:t>
       </w:r>
@@ -3983,20 +4551,120 @@
           <w:top w:val="single" w:sz="6" w:space="10" w:color="FF4A1C"/>
         </w:pBdr>
         <w:spacing w:before="400" w:after="160"/>
-      </w:pPr>
-      <w:r>
         <w:rPr>
           <w:rFonts w:ascii="Funnel Display" w:eastAsia="Funnel Display" w:hAnsi="Funnel Display" w:cs="Funnel Display"/>
           <w:color w:val="1D1E21"/>
           <w:sz w:val="34"/>
           <w:szCs w:val="34"/>
         </w:rPr>
+      </w:pPr>
+    </w:p>
+    <w:p>
+      <w:pPr>
+        <w:pStyle w:val="Heading1"/>
+        <w:keepNext/>
+        <w:pBdr>
+          <w:top w:val="single" w:sz="6" w:space="10" w:color="FF4A1C"/>
+        </w:pBdr>
+        <w:spacing w:before="400" w:after="160"/>
+        <w:rPr>
+          <w:rFonts w:ascii="Funnel Display" w:eastAsia="Funnel Display" w:hAnsi="Funnel Display" w:cs="Funnel Display"/>
+          <w:color w:val="1D1E21"/>
+          <w:sz w:val="34"/>
+          <w:szCs w:val="34"/>
+        </w:rPr>
+      </w:pPr>
+    </w:p>
+    <w:p>
+      <w:pPr>
+        <w:pStyle w:val="Heading1"/>
+        <w:keepNext/>
+        <w:pBdr>
+          <w:top w:val="single" w:sz="6" w:space="10" w:color="FF4A1C"/>
+        </w:pBdr>
+        <w:spacing w:before="400" w:after="160"/>
+        <w:rPr>
+          <w:rFonts w:ascii="Funnel Display" w:eastAsia="Funnel Display" w:hAnsi="Funnel Display" w:cs="Funnel Display"/>
+          <w:color w:val="1D1E21"/>
+          <w:sz w:val="34"/>
+          <w:szCs w:val="34"/>
+        </w:rPr>
+      </w:pPr>
+    </w:p>
+    <w:p>
+      <w:pPr>
+        <w:pStyle w:val="Heading1"/>
+        <w:keepNext/>
+        <w:pBdr>
+          <w:top w:val="single" w:sz="6" w:space="10" w:color="FF4A1C"/>
+        </w:pBdr>
+        <w:spacing w:before="400" w:after="160"/>
+        <w:rPr>
+          <w:rFonts w:ascii="Funnel Display" w:eastAsia="Funnel Display" w:hAnsi="Funnel Display" w:cs="Funnel Display"/>
+          <w:color w:val="1D1E21"/>
+          <w:sz w:val="34"/>
+          <w:szCs w:val="34"/>
+        </w:rPr>
+      </w:pPr>
+    </w:p>
+    <w:p>
+      <w:pPr>
+        <w:pStyle w:val="Heading1"/>
+        <w:keepNext/>
+        <w:pBdr>
+          <w:top w:val="single" w:sz="6" w:space="10" w:color="FF4A1C"/>
+        </w:pBdr>
+        <w:spacing w:before="400" w:after="160"/>
+        <w:rPr>
+          <w:rFonts w:ascii="Funnel Display" w:eastAsia="Funnel Display" w:hAnsi="Funnel Display" w:cs="Funnel Display"/>
+          <w:color w:val="1D1E21"/>
+          <w:sz w:val="34"/>
+          <w:szCs w:val="34"/>
+        </w:rPr>
+      </w:pPr>
+    </w:p>
+    <w:p>
+      <w:pPr>
+        <w:pStyle w:val="Heading1"/>
+        <w:keepNext/>
+        <w:pBdr>
+          <w:top w:val="single" w:sz="6" w:space="10" w:color="FF4A1C"/>
+        </w:pBdr>
+        <w:spacing w:before="400" w:after="160"/>
+        <w:rPr>
+          <w:rFonts w:ascii="Funnel Display" w:eastAsia="Funnel Display" w:hAnsi="Funnel Display" w:cs="Funnel Display"/>
+          <w:color w:val="1D1E21"/>
+          <w:sz w:val="34"/>
+          <w:szCs w:val="34"/>
+        </w:rPr>
+      </w:pPr>
+    </w:p>
+    <w:p/>
+    <w:p/>
+    <w:p/>
+    <w:p>
+      <w:pPr>
+        <w:pStyle w:val="Heading1"/>
+        <w:keepNext/>
+        <w:pBdr>
+          <w:top w:val="single" w:sz="6" w:space="10" w:color="FF4A1C"/>
+        </w:pBdr>
+        <w:spacing w:before="400" w:after="160"/>
+      </w:pPr>
+      <w:r>
+        <w:rPr>
+          <w:rFonts w:ascii="Funnel Display" w:eastAsia="Funnel Display" w:hAnsi="Funnel Display" w:cs="Funnel Display"/>
+          <w:color w:val="1D1E21"/>
+          <w:sz w:val="34"/>
+          <w:szCs w:val="34"/>
+        </w:rPr>
+        <w:lastRenderedPageBreak/>
         <w:t>Top 5 actions</w:t>
       </w:r>
     </w:p>
     <w:tbl>
       <w:tblPr>
-        <w:tblW w:w="9360" w:type="dxa"/>
+        <w:tblW w:w="10164" w:type="dxa"/>
         <w:tblBorders>
           <w:top w:val="single" w:sz="4" w:space="0" w:color="auto"/>
           <w:left w:val="single" w:sz="4" w:space="0" w:color="auto"/>
@@ -4008,14 +4676,14 @@
         <w:tblLook w:val="04A0" w:firstRow="1" w:lastRow="0" w:firstColumn="1" w:lastColumn="0" w:noHBand="0" w:noVBand="1"/>
       </w:tblPr>
       <w:tblGrid>
-        <w:gridCol w:w="293"/>
-        <w:gridCol w:w="2194"/>
-        <w:gridCol w:w="2194"/>
-        <w:gridCol w:w="622"/>
-        <w:gridCol w:w="293"/>
-        <w:gridCol w:w="293"/>
-        <w:gridCol w:w="1280"/>
-        <w:gridCol w:w="2191"/>
+        <w:gridCol w:w="296"/>
+        <w:gridCol w:w="2579"/>
+        <w:gridCol w:w="1774"/>
+        <w:gridCol w:w="1176"/>
+        <w:gridCol w:w="740"/>
+        <w:gridCol w:w="740"/>
+        <w:gridCol w:w="1117"/>
+        <w:gridCol w:w="1742"/>
       </w:tblGrid>
       <w:tr>
         <w:trPr>
@@ -4024,7 +4692,7 @@
         </w:trPr>
         <w:tc>
           <w:tcPr>
-            <w:tcW w:w="293" w:type="dxa"/>
+            <w:tcW w:w="296" w:type="dxa"/>
             <w:tcBorders>
               <w:top w:val="single" w:sz="4" w:space="0" w:color="C9CCCF"/>
               <w:left w:val="single" w:sz="4" w:space="0" w:color="C9CCCF"/>
@@ -4056,7 +4724,7 @@
         </w:tc>
         <w:tc>
           <w:tcPr>
-            <w:tcW w:w="2194" w:type="dxa"/>
+            <w:tcW w:w="2579" w:type="dxa"/>
             <w:tcBorders>
               <w:top w:val="single" w:sz="4" w:space="0" w:color="C9CCCF"/>
               <w:left w:val="single" w:sz="4" w:space="0" w:color="C9CCCF"/>
@@ -4088,7 +4756,7 @@
         </w:tc>
         <w:tc>
           <w:tcPr>
-            <w:tcW w:w="2194" w:type="dxa"/>
+            <w:tcW w:w="1774" w:type="dxa"/>
             <w:tcBorders>
               <w:top w:val="single" w:sz="4" w:space="0" w:color="C9CCCF"/>
               <w:left w:val="single" w:sz="4" w:space="0" w:color="C9CCCF"/>
@@ -4120,7 +4788,7 @@
         </w:tc>
         <w:tc>
           <w:tcPr>
-            <w:tcW w:w="622" w:type="dxa"/>
+            <w:tcW w:w="1176" w:type="dxa"/>
             <w:tcBorders>
               <w:top w:val="single" w:sz="4" w:space="0" w:color="C9CCCF"/>
               <w:left w:val="single" w:sz="4" w:space="0" w:color="C9CCCF"/>
@@ -4152,7 +4820,7 @@
         </w:tc>
         <w:tc>
           <w:tcPr>
-            <w:tcW w:w="293" w:type="dxa"/>
+            <w:tcW w:w="740" w:type="dxa"/>
             <w:tcBorders>
               <w:top w:val="single" w:sz="4" w:space="0" w:color="C9CCCF"/>
               <w:left w:val="single" w:sz="4" w:space="0" w:color="C9CCCF"/>
@@ -4184,7 +4852,7 @@
         </w:tc>
         <w:tc>
           <w:tcPr>
-            <w:tcW w:w="293" w:type="dxa"/>
+            <w:tcW w:w="740" w:type="dxa"/>
             <w:tcBorders>
               <w:top w:val="single" w:sz="4" w:space="0" w:color="C9CCCF"/>
               <w:left w:val="single" w:sz="4" w:space="0" w:color="C9CCCF"/>
@@ -4216,7 +4884,7 @@
         </w:tc>
         <w:tc>
           <w:tcPr>
-            <w:tcW w:w="1280" w:type="dxa"/>
+            <w:tcW w:w="1117" w:type="dxa"/>
             <w:tcBorders>
               <w:top w:val="single" w:sz="4" w:space="0" w:color="C9CCCF"/>
               <w:left w:val="single" w:sz="4" w:space="0" w:color="C9CCCF"/>
@@ -4248,7 +4916,7 @@
         </w:tc>
         <w:tc>
           <w:tcPr>
-            <w:tcW w:w="2191" w:type="dxa"/>
+            <w:tcW w:w="1742" w:type="dxa"/>
             <w:tcBorders>
               <w:top w:val="single" w:sz="4" w:space="0" w:color="C9CCCF"/>
               <w:left w:val="single" w:sz="4" w:space="0" w:color="C9CCCF"/>
@@ -4285,7 +4953,7 @@
         </w:trPr>
         <w:tc>
           <w:tcPr>
-            <w:tcW w:w="293" w:type="dxa"/>
+            <w:tcW w:w="296" w:type="dxa"/>
             <w:tcBorders>
               <w:top w:val="single" w:sz="4" w:space="0" w:color="C9CCCF"/>
               <w:left w:val="single" w:sz="4" w:space="0" w:color="C9CCCF"/>
@@ -4314,24 +4982,25 @@
         </w:tc>
         <w:tc>
           <w:tcPr>
-            <w:tcW w:w="2194" w:type="dxa"/>
-            <w:tcBorders>
-              <w:top w:val="single" w:sz="4" w:space="0" w:color="C9CCCF"/>
-              <w:left w:val="single" w:sz="4" w:space="0" w:color="C9CCCF"/>
-              <w:bottom w:val="single" w:sz="4" w:space="0" w:color="C9CCCF"/>
-              <w:right w:val="single" w:sz="4" w:space="0" w:color="C9CCCF"/>
-            </w:tcBorders>
-            <w:tcMar>
-              <w:top w:w="70" w:type="dxa"/>
-              <w:left w:w="100" w:type="dxa"/>
-              <w:bottom w:w="70" w:type="dxa"/>
-              <w:right w:w="100" w:type="dxa"/>
-            </w:tcMar>
-          </w:tcPr>
-          <w:p>
-            <w:pPr>
-              <w:spacing w:line="260" w:lineRule="auto"/>
-            </w:pPr>
+            <w:tcW w:w="2579" w:type="dxa"/>
+            <w:tcBorders>
+              <w:top w:val="single" w:sz="4" w:space="0" w:color="C9CCCF"/>
+              <w:left w:val="single" w:sz="4" w:space="0" w:color="C9CCCF"/>
+              <w:bottom w:val="single" w:sz="4" w:space="0" w:color="C9CCCF"/>
+              <w:right w:val="single" w:sz="4" w:space="0" w:color="C9CCCF"/>
+            </w:tcBorders>
+            <w:tcMar>
+              <w:top w:w="70" w:type="dxa"/>
+              <w:left w:w="100" w:type="dxa"/>
+              <w:bottom w:w="70" w:type="dxa"/>
+              <w:right w:w="100" w:type="dxa"/>
+            </w:tcMar>
+          </w:tcPr>
+          <w:p>
+            <w:pPr>
+              <w:spacing w:line="260" w:lineRule="auto"/>
+            </w:pPr>
+            <w:bookmarkStart w:id="0" w:name="_GoBack"/>
             <w:r>
               <w:rPr>
                 <w:b/>
@@ -4346,8 +5015,25 @@
                 <w:sz w:val="15"/>
                 <w:szCs w:val="15"/>
               </w:rPr>
-              <w:t xml:space="preserve"> OpenAI pixel via GTM, fire </w:t>
-            </w:r>
+              <w:t xml:space="preserve"> </w:t>
+            </w:r>
+            <w:proofErr w:type="spellStart"/>
+            <w:r>
+              <w:rPr>
+                <w:sz w:val="15"/>
+                <w:szCs w:val="15"/>
+              </w:rPr>
+              <w:t>OpenAI</w:t>
+            </w:r>
+            <w:proofErr w:type="spellEnd"/>
+            <w:r>
+              <w:rPr>
+                <w:sz w:val="15"/>
+                <w:szCs w:val="15"/>
+              </w:rPr>
+              <w:t xml:space="preserve"> pixel via GTM, fire </w:t>
+            </w:r>
+            <w:proofErr w:type="spellStart"/>
             <w:r>
               <w:rPr>
                 <w:rFonts w:ascii="JetBrains Mono" w:eastAsia="JetBrains Mono" w:hAnsi="JetBrains Mono" w:cs="JetBrains Mono"/>
@@ -4357,6 +5043,7 @@
               </w:rPr>
               <w:t>lead_created</w:t>
             </w:r>
+            <w:proofErr w:type="spellEnd"/>
             <w:r>
               <w:rPr>
                 <w:sz w:val="15"/>
@@ -4380,6 +5067,7 @@
               </w:rPr>
               <w:t xml:space="preserve">, pop-up), link the event to the campaign, add a </w:t>
             </w:r>
+            <w:proofErr w:type="spellStart"/>
             <w:r>
               <w:rPr>
                 <w:rFonts w:ascii="JetBrains Mono" w:eastAsia="JetBrains Mono" w:hAnsi="JetBrains Mono" w:cs="JetBrains Mono"/>
@@ -4389,6 +5077,7 @@
               </w:rPr>
               <w:t>utm_content</w:t>
             </w:r>
+            <w:proofErr w:type="spellEnd"/>
             <w:r>
               <w:rPr>
                 <w:sz w:val="15"/>
@@ -4396,47 +5085,41 @@
               </w:rPr>
               <w:t xml:space="preserve"> hidden field</w:t>
             </w:r>
-          </w:p>
-        </w:tc>
-        <w:tc>
-          <w:tcPr>
-            <w:tcW w:w="2194" w:type="dxa"/>
-            <w:tcBorders>
-              <w:top w:val="single" w:sz="4" w:space="0" w:color="C9CCCF"/>
-              <w:left w:val="single" w:sz="4" w:space="0" w:color="C9CCCF"/>
-              <w:bottom w:val="single" w:sz="4" w:space="0" w:color="C9CCCF"/>
-              <w:right w:val="single" w:sz="4" w:space="0" w:color="C9CCCF"/>
-            </w:tcBorders>
-            <w:tcMar>
-              <w:top w:w="70" w:type="dxa"/>
-              <w:left w:w="100" w:type="dxa"/>
-              <w:bottom w:w="70" w:type="dxa"/>
-              <w:right w:w="100" w:type="dxa"/>
-            </w:tcMar>
-          </w:tcPr>
-          <w:p>
-            <w:pPr>
-              <w:spacing w:line="260" w:lineRule="auto"/>
-            </w:pPr>
-            <w:r>
-              <w:rPr>
-                <w:sz w:val="15"/>
-                <w:szCs w:val="15"/>
-              </w:rPr>
-              <w:t>0 events ever; platform optimizing blind;</w:t>
-            </w:r>
-            <w:r>
-              <w:rPr>
-                <w:sz w:val="15"/>
-                <w:szCs w:val="15"/>
-              </w:rPr>
-              <w:t xml:space="preserve"> can't tell which ad works</w:t>
-            </w:r>
-          </w:p>
-        </w:tc>
-        <w:tc>
-          <w:tcPr>
-            <w:tcW w:w="622" w:type="dxa"/>
+            <w:bookmarkEnd w:id="0"/>
+          </w:p>
+        </w:tc>
+        <w:tc>
+          <w:tcPr>
+            <w:tcW w:w="1774" w:type="dxa"/>
+            <w:tcBorders>
+              <w:top w:val="single" w:sz="4" w:space="0" w:color="C9CCCF"/>
+              <w:left w:val="single" w:sz="4" w:space="0" w:color="C9CCCF"/>
+              <w:bottom w:val="single" w:sz="4" w:space="0" w:color="C9CCCF"/>
+              <w:right w:val="single" w:sz="4" w:space="0" w:color="C9CCCF"/>
+            </w:tcBorders>
+            <w:tcMar>
+              <w:top w:w="70" w:type="dxa"/>
+              <w:left w:w="100" w:type="dxa"/>
+              <w:bottom w:w="70" w:type="dxa"/>
+              <w:right w:w="100" w:type="dxa"/>
+            </w:tcMar>
+          </w:tcPr>
+          <w:p>
+            <w:pPr>
+              <w:spacing w:line="260" w:lineRule="auto"/>
+            </w:pPr>
+            <w:r>
+              <w:rPr>
+                <w:sz w:val="15"/>
+                <w:szCs w:val="15"/>
+              </w:rPr>
+              <w:t>0 events ever; platform optimizing blind; can't tell which ad works</w:t>
+            </w:r>
+          </w:p>
+        </w:tc>
+        <w:tc>
+          <w:tcPr>
+            <w:tcW w:w="1176" w:type="dxa"/>
             <w:tcBorders>
               <w:top w:val="single" w:sz="4" w:space="0" w:color="C9CCCF"/>
               <w:left w:val="single" w:sz="4" w:space="0" w:color="C9CCCF"/>
@@ -4465,7 +5148,7 @@
         </w:tc>
         <w:tc>
           <w:tcPr>
-            <w:tcW w:w="293" w:type="dxa"/>
+            <w:tcW w:w="740" w:type="dxa"/>
             <w:tcBorders>
               <w:top w:val="single" w:sz="4" w:space="0" w:color="C9CCCF"/>
               <w:left w:val="single" w:sz="4" w:space="0" w:color="C9CCCF"/>
@@ -4494,7 +5177,7 @@
         </w:tc>
         <w:tc>
           <w:tcPr>
-            <w:tcW w:w="293" w:type="dxa"/>
+            <w:tcW w:w="740" w:type="dxa"/>
             <w:tcBorders>
               <w:top w:val="single" w:sz="4" w:space="0" w:color="C9CCCF"/>
               <w:left w:val="single" w:sz="4" w:space="0" w:color="C9CCCF"/>
@@ -4523,36 +5206,45 @@
         </w:tc>
         <w:tc>
           <w:tcPr>
-            <w:tcW w:w="1280" w:type="dxa"/>
-            <w:tcBorders>
-              <w:top w:val="single" w:sz="4" w:space="0" w:color="C9CCCF"/>
-              <w:left w:val="single" w:sz="4" w:space="0" w:color="C9CCCF"/>
-              <w:bottom w:val="single" w:sz="4" w:space="0" w:color="C9CCCF"/>
-              <w:right w:val="single" w:sz="4" w:space="0" w:color="C9CCCF"/>
-            </w:tcBorders>
-            <w:tcMar>
-              <w:top w:w="70" w:type="dxa"/>
-              <w:left w:w="100" w:type="dxa"/>
-              <w:bottom w:w="70" w:type="dxa"/>
-              <w:right w:w="100" w:type="dxa"/>
-            </w:tcMar>
-          </w:tcPr>
-          <w:p>
-            <w:pPr>
-              <w:spacing w:line="260" w:lineRule="auto"/>
-            </w:pPr>
-            <w:r>
-              <w:rPr>
-                <w:sz w:val="15"/>
-                <w:szCs w:val="15"/>
-              </w:rPr>
-              <w:t>TekRevol web dev</w:t>
-            </w:r>
-          </w:p>
-        </w:tc>
-        <w:tc>
-          <w:tcPr>
-            <w:tcW w:w="2191" w:type="dxa"/>
+            <w:tcW w:w="1117" w:type="dxa"/>
+            <w:tcBorders>
+              <w:top w:val="single" w:sz="4" w:space="0" w:color="C9CCCF"/>
+              <w:left w:val="single" w:sz="4" w:space="0" w:color="C9CCCF"/>
+              <w:bottom w:val="single" w:sz="4" w:space="0" w:color="C9CCCF"/>
+              <w:right w:val="single" w:sz="4" w:space="0" w:color="C9CCCF"/>
+            </w:tcBorders>
+            <w:tcMar>
+              <w:top w:w="70" w:type="dxa"/>
+              <w:left w:w="100" w:type="dxa"/>
+              <w:bottom w:w="70" w:type="dxa"/>
+              <w:right w:w="100" w:type="dxa"/>
+            </w:tcMar>
+          </w:tcPr>
+          <w:p>
+            <w:pPr>
+              <w:spacing w:line="260" w:lineRule="auto"/>
+            </w:pPr>
+            <w:proofErr w:type="spellStart"/>
+            <w:r>
+              <w:rPr>
+                <w:sz w:val="15"/>
+                <w:szCs w:val="15"/>
+              </w:rPr>
+              <w:t>TekRevol</w:t>
+            </w:r>
+            <w:proofErr w:type="spellEnd"/>
+            <w:r>
+              <w:rPr>
+                <w:sz w:val="15"/>
+                <w:szCs w:val="15"/>
+              </w:rPr>
+              <w:t xml:space="preserve"> web dev</w:t>
+            </w:r>
+          </w:p>
+        </w:tc>
+        <w:tc>
+          <w:tcPr>
+            <w:tcW w:w="1742" w:type="dxa"/>
             <w:tcBorders>
               <w:top w:val="single" w:sz="4" w:space="0" w:color="C9CCCF"/>
               <w:left w:val="single" w:sz="4" w:space="0" w:color="C9CCCF"/>
@@ -4586,7 +5278,7 @@
         </w:trPr>
         <w:tc>
           <w:tcPr>
-            <w:tcW w:w="293" w:type="dxa"/>
+            <w:tcW w:w="296" w:type="dxa"/>
             <w:tcBorders>
               <w:top w:val="single" w:sz="4" w:space="0" w:color="C9CCCF"/>
               <w:left w:val="single" w:sz="4" w:space="0" w:color="C9CCCF"/>
@@ -4616,7 +5308,7 @@
         </w:tc>
         <w:tc>
           <w:tcPr>
-            <w:tcW w:w="2194" w:type="dxa"/>
+            <w:tcW w:w="2579" w:type="dxa"/>
             <w:tcBorders>
               <w:top w:val="single" w:sz="4" w:space="0" w:color="C9CCCF"/>
               <w:left w:val="single" w:sz="4" w:space="0" w:color="C9CCCF"/>
@@ -4649,13 +5341,29 @@
                 <w:sz w:val="15"/>
                 <w:szCs w:val="15"/>
               </w:rPr>
-              <w:t xml:space="preserve"> for healthcare operations AI (spec below), no nav, noindex, used only for paid traffic</w:t>
-            </w:r>
-          </w:p>
-        </w:tc>
-        <w:tc>
-          <w:tcPr>
-            <w:tcW w:w="2194" w:type="dxa"/>
+              <w:t xml:space="preserve"> for healthcare operations AI (spec below), no nav, </w:t>
+            </w:r>
+            <w:proofErr w:type="spellStart"/>
+            <w:r>
+              <w:rPr>
+                <w:sz w:val="15"/>
+                <w:szCs w:val="15"/>
+              </w:rPr>
+              <w:t>noindex</w:t>
+            </w:r>
+            <w:proofErr w:type="spellEnd"/>
+            <w:r>
+              <w:rPr>
+                <w:sz w:val="15"/>
+                <w:szCs w:val="15"/>
+              </w:rPr>
+              <w:t>, used only for paid traffic</w:t>
+            </w:r>
+          </w:p>
+        </w:tc>
+        <w:tc>
+          <w:tcPr>
+            <w:tcW w:w="1774" w:type="dxa"/>
             <w:tcBorders>
               <w:top w:val="single" w:sz="4" w:space="0" w:color="C9CCCF"/>
               <w:left w:val="single" w:sz="4" w:space="0" w:color="C9CCCF"/>
@@ -4685,7 +5393,7 @@
         </w:tc>
         <w:tc>
           <w:tcPr>
-            <w:tcW w:w="622" w:type="dxa"/>
+            <w:tcW w:w="1176" w:type="dxa"/>
             <w:tcBorders>
               <w:top w:val="single" w:sz="4" w:space="0" w:color="C9CCCF"/>
               <w:left w:val="single" w:sz="4" w:space="0" w:color="C9CCCF"/>
@@ -4715,7 +5423,7 @@
         </w:tc>
         <w:tc>
           <w:tcPr>
-            <w:tcW w:w="293" w:type="dxa"/>
+            <w:tcW w:w="740" w:type="dxa"/>
             <w:tcBorders>
               <w:top w:val="single" w:sz="4" w:space="0" w:color="C9CCCF"/>
               <w:left w:val="single" w:sz="4" w:space="0" w:color="C9CCCF"/>
@@ -4745,7 +5453,7 @@
         </w:tc>
         <w:tc>
           <w:tcPr>
-            <w:tcW w:w="293" w:type="dxa"/>
+            <w:tcW w:w="740" w:type="dxa"/>
             <w:tcBorders>
               <w:top w:val="single" w:sz="4" w:space="0" w:color="C9CCCF"/>
               <w:left w:val="single" w:sz="4" w:space="0" w:color="C9CCCF"/>
@@ -4775,7 +5483,7 @@
         </w:tc>
         <w:tc>
           <w:tcPr>
-            <w:tcW w:w="1280" w:type="dxa"/>
+            <w:tcW w:w="1117" w:type="dxa"/>
             <w:tcBorders>
               <w:top w:val="single" w:sz="4" w:space="0" w:color="C9CCCF"/>
               <w:left w:val="single" w:sz="4" w:space="0" w:color="C9CCCF"/>
@@ -4799,13 +5507,29 @@
                 <w:sz w:val="15"/>
                 <w:szCs w:val="15"/>
               </w:rPr>
-              <w:t>Sana (copy) · TekRevol design + dev</w:t>
-            </w:r>
-          </w:p>
-        </w:tc>
-        <w:tc>
-          <w:tcPr>
-            <w:tcW w:w="2191" w:type="dxa"/>
+              <w:t xml:space="preserve">Sana (copy) · </w:t>
+            </w:r>
+            <w:proofErr w:type="spellStart"/>
+            <w:r>
+              <w:rPr>
+                <w:sz w:val="15"/>
+                <w:szCs w:val="15"/>
+              </w:rPr>
+              <w:t>TekRevol</w:t>
+            </w:r>
+            <w:proofErr w:type="spellEnd"/>
+            <w:r>
+              <w:rPr>
+                <w:sz w:val="15"/>
+                <w:szCs w:val="15"/>
+              </w:rPr>
+              <w:t xml:space="preserve"> design + dev</w:t>
+            </w:r>
+          </w:p>
+        </w:tc>
+        <w:tc>
+          <w:tcPr>
+            <w:tcW w:w="1742" w:type="dxa"/>
             <w:tcBorders>
               <w:top w:val="single" w:sz="4" w:space="0" w:color="C9CCCF"/>
               <w:left w:val="single" w:sz="4" w:space="0" w:color="C9CCCF"/>
@@ -4840,7 +5564,7 @@
         </w:trPr>
         <w:tc>
           <w:tcPr>
-            <w:tcW w:w="293" w:type="dxa"/>
+            <w:tcW w:w="296" w:type="dxa"/>
             <w:tcBorders>
               <w:top w:val="single" w:sz="4" w:space="0" w:color="C9CCCF"/>
               <w:left w:val="single" w:sz="4" w:space="0" w:color="C9CCCF"/>
@@ -4869,7 +5593,7 @@
         </w:tc>
         <w:tc>
           <w:tcPr>
-            <w:tcW w:w="2194" w:type="dxa"/>
+            <w:tcW w:w="2579" w:type="dxa"/>
             <w:tcBorders>
               <w:top w:val="single" w:sz="4" w:space="0" w:color="C9CCCF"/>
               <w:left w:val="single" w:sz="4" w:space="0" w:color="C9CCCF"/>
@@ -4907,7 +5631,7 @@
         </w:tc>
         <w:tc>
           <w:tcPr>
-            <w:tcW w:w="2194" w:type="dxa"/>
+            <w:tcW w:w="1774" w:type="dxa"/>
             <w:tcBorders>
               <w:top w:val="single" w:sz="4" w:space="0" w:color="C9CCCF"/>
               <w:left w:val="single" w:sz="4" w:space="0" w:color="C9CCCF"/>
@@ -4936,7 +5660,7 @@
         </w:tc>
         <w:tc>
           <w:tcPr>
-            <w:tcW w:w="622" w:type="dxa"/>
+            <w:tcW w:w="1176" w:type="dxa"/>
             <w:tcBorders>
               <w:top w:val="single" w:sz="4" w:space="0" w:color="C9CCCF"/>
               <w:left w:val="single" w:sz="4" w:space="0" w:color="C9CCCF"/>
@@ -4965,7 +5689,7 @@
         </w:tc>
         <w:tc>
           <w:tcPr>
-            <w:tcW w:w="293" w:type="dxa"/>
+            <w:tcW w:w="740" w:type="dxa"/>
             <w:tcBorders>
               <w:top w:val="single" w:sz="4" w:space="0" w:color="C9CCCF"/>
               <w:left w:val="single" w:sz="4" w:space="0" w:color="C9CCCF"/>
@@ -4994,7 +5718,7 @@
         </w:tc>
         <w:tc>
           <w:tcPr>
-            <w:tcW w:w="293" w:type="dxa"/>
+            <w:tcW w:w="740" w:type="dxa"/>
             <w:tcBorders>
               <w:top w:val="single" w:sz="4" w:space="0" w:color="C9CCCF"/>
               <w:left w:val="single" w:sz="4" w:space="0" w:color="C9CCCF"/>
@@ -5023,66 +5747,75 @@
         </w:tc>
         <w:tc>
           <w:tcPr>
-            <w:tcW w:w="1280" w:type="dxa"/>
-            <w:tcBorders>
-              <w:top w:val="single" w:sz="4" w:space="0" w:color="C9CCCF"/>
-              <w:left w:val="single" w:sz="4" w:space="0" w:color="C9CCCF"/>
-              <w:bottom w:val="single" w:sz="4" w:space="0" w:color="C9CCCF"/>
-              <w:right w:val="single" w:sz="4" w:space="0" w:color="C9CCCF"/>
-            </w:tcBorders>
-            <w:tcMar>
-              <w:top w:w="70" w:type="dxa"/>
-              <w:left w:w="100" w:type="dxa"/>
-              <w:bottom w:w="70" w:type="dxa"/>
-              <w:right w:w="100" w:type="dxa"/>
-            </w:tcMar>
-          </w:tcPr>
-          <w:p>
-            <w:pPr>
-              <w:spacing w:line="260" w:lineRule="auto"/>
-            </w:pPr>
-            <w:r>
-              <w:rPr>
-                <w:sz w:val="15"/>
-                <w:szCs w:val="15"/>
-              </w:rPr>
-              <w:t>Sana · TekRevol sales</w:t>
-            </w:r>
-          </w:p>
-        </w:tc>
-        <w:tc>
-          <w:tcPr>
-            <w:tcW w:w="2191" w:type="dxa"/>
-            <w:tcBorders>
-              <w:top w:val="single" w:sz="4" w:space="0" w:color="C9CCCF"/>
-              <w:left w:val="single" w:sz="4" w:space="0" w:color="C9CCCF"/>
-              <w:bottom w:val="single" w:sz="4" w:space="0" w:color="C9CCCF"/>
-              <w:right w:val="single" w:sz="4" w:space="0" w:color="C9CCCF"/>
-            </w:tcBorders>
-            <w:tcMar>
-              <w:top w:w="70" w:type="dxa"/>
-              <w:left w:w="100" w:type="dxa"/>
-              <w:bottom w:w="70" w:type="dxa"/>
-              <w:right w:w="100" w:type="dxa"/>
-            </w:tcMar>
-          </w:tcPr>
-          <w:p>
-            <w:pPr>
-              <w:spacing w:line="260" w:lineRule="auto"/>
-            </w:pPr>
-            <w:r>
-              <w:rPr>
-                <w:sz w:val="15"/>
-                <w:szCs w:val="15"/>
-              </w:rPr>
-              <w:t>Form submits per 100 clicks; show</w:t>
-            </w:r>
-            <w:r>
-              <w:rPr>
-                <w:sz w:val="15"/>
-                <w:szCs w:val="15"/>
-              </w:rPr>
-              <w:t xml:space="preserve"> rate on booked calls</w:t>
+            <w:tcW w:w="1117" w:type="dxa"/>
+            <w:tcBorders>
+              <w:top w:val="single" w:sz="4" w:space="0" w:color="C9CCCF"/>
+              <w:left w:val="single" w:sz="4" w:space="0" w:color="C9CCCF"/>
+              <w:bottom w:val="single" w:sz="4" w:space="0" w:color="C9CCCF"/>
+              <w:right w:val="single" w:sz="4" w:space="0" w:color="C9CCCF"/>
+            </w:tcBorders>
+            <w:tcMar>
+              <w:top w:w="70" w:type="dxa"/>
+              <w:left w:w="100" w:type="dxa"/>
+              <w:bottom w:w="70" w:type="dxa"/>
+              <w:right w:w="100" w:type="dxa"/>
+            </w:tcMar>
+          </w:tcPr>
+          <w:p>
+            <w:pPr>
+              <w:spacing w:line="260" w:lineRule="auto"/>
+            </w:pPr>
+            <w:r>
+              <w:rPr>
+                <w:sz w:val="15"/>
+                <w:szCs w:val="15"/>
+              </w:rPr>
+              <w:t xml:space="preserve">Sana · </w:t>
+            </w:r>
+            <w:proofErr w:type="spellStart"/>
+            <w:r>
+              <w:rPr>
+                <w:sz w:val="15"/>
+                <w:szCs w:val="15"/>
+              </w:rPr>
+              <w:t>TekRevol</w:t>
+            </w:r>
+            <w:proofErr w:type="spellEnd"/>
+            <w:r>
+              <w:rPr>
+                <w:sz w:val="15"/>
+                <w:szCs w:val="15"/>
+              </w:rPr>
+              <w:t xml:space="preserve"> sales</w:t>
+            </w:r>
+          </w:p>
+        </w:tc>
+        <w:tc>
+          <w:tcPr>
+            <w:tcW w:w="1742" w:type="dxa"/>
+            <w:tcBorders>
+              <w:top w:val="single" w:sz="4" w:space="0" w:color="C9CCCF"/>
+              <w:left w:val="single" w:sz="4" w:space="0" w:color="C9CCCF"/>
+              <w:bottom w:val="single" w:sz="4" w:space="0" w:color="C9CCCF"/>
+              <w:right w:val="single" w:sz="4" w:space="0" w:color="C9CCCF"/>
+            </w:tcBorders>
+            <w:tcMar>
+              <w:top w:w="70" w:type="dxa"/>
+              <w:left w:w="100" w:type="dxa"/>
+              <w:bottom w:w="70" w:type="dxa"/>
+              <w:right w:w="100" w:type="dxa"/>
+            </w:tcMar>
+          </w:tcPr>
+          <w:p>
+            <w:pPr>
+              <w:spacing w:line="260" w:lineRule="auto"/>
+            </w:pPr>
+            <w:r>
+              <w:rPr>
+                <w:sz w:val="15"/>
+                <w:szCs w:val="15"/>
+              </w:rPr>
+              <w:t>Form submits per 100 clicks; show rate on booked calls</w:t>
             </w:r>
           </w:p>
         </w:tc>
@@ -5093,7 +5826,7 @@
         </w:trPr>
         <w:tc>
           <w:tcPr>
-            <w:tcW w:w="293" w:type="dxa"/>
+            <w:tcW w:w="296" w:type="dxa"/>
             <w:tcBorders>
               <w:top w:val="single" w:sz="4" w:space="0" w:color="C9CCCF"/>
               <w:left w:val="single" w:sz="4" w:space="0" w:color="C9CCCF"/>
@@ -5123,7 +5856,7 @@
         </w:tc>
         <w:tc>
           <w:tcPr>
-            <w:tcW w:w="2194" w:type="dxa"/>
+            <w:tcW w:w="2579" w:type="dxa"/>
             <w:tcBorders>
               <w:top w:val="single" w:sz="4" w:space="0" w:color="C9CCCF"/>
               <w:left w:val="single" w:sz="4" w:space="0" w:color="C9CCCF"/>
@@ -5156,13 +5889,29 @@
                 <w:sz w:val="15"/>
                 <w:szCs w:val="15"/>
               </w:rPr>
-              <w:t xml:space="preserve"> name, work email, organization type (dropdown), biggest manual task (optional). Phone optional. Invisible reCAPTCHA. Thank-you page with a calendar to book the call</w:t>
-            </w:r>
-          </w:p>
-        </w:tc>
-        <w:tc>
-          <w:tcPr>
-            <w:tcW w:w="2194" w:type="dxa"/>
+              <w:t xml:space="preserve"> name, work email, organization type (dropdown), biggest manual task (optional). Phone optional. Invisible </w:t>
+            </w:r>
+            <w:proofErr w:type="spellStart"/>
+            <w:r>
+              <w:rPr>
+                <w:sz w:val="15"/>
+                <w:szCs w:val="15"/>
+              </w:rPr>
+              <w:t>reCAPTCHA</w:t>
+            </w:r>
+            <w:proofErr w:type="spellEnd"/>
+            <w:r>
+              <w:rPr>
+                <w:sz w:val="15"/>
+                <w:szCs w:val="15"/>
+              </w:rPr>
+              <w:t>. Thank-you page with a calendar to book the call</w:t>
+            </w:r>
+          </w:p>
+        </w:tc>
+        <w:tc>
+          <w:tcPr>
+            <w:tcW w:w="1774" w:type="dxa"/>
             <w:tcBorders>
               <w:top w:val="single" w:sz="4" w:space="0" w:color="C9CCCF"/>
               <w:left w:val="single" w:sz="4" w:space="0" w:color="C9CCCF"/>
@@ -5192,7 +5941,7 @@
         </w:tc>
         <w:tc>
           <w:tcPr>
-            <w:tcW w:w="622" w:type="dxa"/>
+            <w:tcW w:w="1176" w:type="dxa"/>
             <w:tcBorders>
               <w:top w:val="single" w:sz="4" w:space="0" w:color="C9CCCF"/>
               <w:left w:val="single" w:sz="4" w:space="0" w:color="C9CCCF"/>
@@ -5222,7 +5971,7 @@
         </w:tc>
         <w:tc>
           <w:tcPr>
-            <w:tcW w:w="293" w:type="dxa"/>
+            <w:tcW w:w="740" w:type="dxa"/>
             <w:tcBorders>
               <w:top w:val="single" w:sz="4" w:space="0" w:color="C9CCCF"/>
               <w:left w:val="single" w:sz="4" w:space="0" w:color="C9CCCF"/>
@@ -5252,7 +6001,7 @@
         </w:tc>
         <w:tc>
           <w:tcPr>
-            <w:tcW w:w="293" w:type="dxa"/>
+            <w:tcW w:w="740" w:type="dxa"/>
             <w:tcBorders>
               <w:top w:val="single" w:sz="4" w:space="0" w:color="C9CCCF"/>
               <w:left w:val="single" w:sz="4" w:space="0" w:color="C9CCCF"/>
@@ -5282,7 +6031,7 @@
         </w:tc>
         <w:tc>
           <w:tcPr>
-            <w:tcW w:w="1280" w:type="dxa"/>
+            <w:tcW w:w="1117" w:type="dxa"/>
             <w:tcBorders>
               <w:top w:val="single" w:sz="4" w:space="0" w:color="C9CCCF"/>
               <w:left w:val="single" w:sz="4" w:space="0" w:color="C9CCCF"/>
@@ -5301,18 +6050,27 @@
             <w:pPr>
               <w:spacing w:line="260" w:lineRule="auto"/>
             </w:pPr>
-            <w:r>
-              <w:rPr>
-                <w:sz w:val="15"/>
-                <w:szCs w:val="15"/>
-              </w:rPr>
-              <w:t>TekRevol dev</w:t>
-            </w:r>
-          </w:p>
-        </w:tc>
-        <w:tc>
-          <w:tcPr>
-            <w:tcW w:w="2191" w:type="dxa"/>
+            <w:proofErr w:type="spellStart"/>
+            <w:r>
+              <w:rPr>
+                <w:sz w:val="15"/>
+                <w:szCs w:val="15"/>
+              </w:rPr>
+              <w:t>TekRevol</w:t>
+            </w:r>
+            <w:proofErr w:type="spellEnd"/>
+            <w:r>
+              <w:rPr>
+                <w:sz w:val="15"/>
+                <w:szCs w:val="15"/>
+              </w:rPr>
+              <w:t xml:space="preserve"> dev</w:t>
+            </w:r>
+          </w:p>
+        </w:tc>
+        <w:tc>
+          <w:tcPr>
+            <w:tcW w:w="1742" w:type="dxa"/>
             <w:tcBorders>
               <w:top w:val="single" w:sz="4" w:space="0" w:color="C9CCCF"/>
               <w:left w:val="single" w:sz="4" w:space="0" w:color="C9CCCF"/>
@@ -5347,7 +6105,7 @@
         </w:trPr>
         <w:tc>
           <w:tcPr>
-            <w:tcW w:w="293" w:type="dxa"/>
+            <w:tcW w:w="296" w:type="dxa"/>
             <w:tcBorders>
               <w:top w:val="single" w:sz="4" w:space="0" w:color="C9CCCF"/>
               <w:left w:val="single" w:sz="4" w:space="0" w:color="C9CCCF"/>
@@ -5376,7 +6134,7 @@
         </w:tc>
         <w:tc>
           <w:tcPr>
-            <w:tcW w:w="2194" w:type="dxa"/>
+            <w:tcW w:w="2579" w:type="dxa"/>
             <w:tcBorders>
               <w:top w:val="single" w:sz="4" w:space="0" w:color="C9CCCF"/>
               <w:left w:val="single" w:sz="4" w:space="0" w:color="C9CCCF"/>
@@ -5414,7 +6172,7 @@
         </w:tc>
         <w:tc>
           <w:tcPr>
-            <w:tcW w:w="2194" w:type="dxa"/>
+            <w:tcW w:w="1774" w:type="dxa"/>
             <w:tcBorders>
               <w:top w:val="single" w:sz="4" w:space="0" w:color="C9CCCF"/>
               <w:left w:val="single" w:sz="4" w:space="0" w:color="C9CCCF"/>
@@ -5443,7 +6201,7 @@
         </w:tc>
         <w:tc>
           <w:tcPr>
-            <w:tcW w:w="622" w:type="dxa"/>
+            <w:tcW w:w="1176" w:type="dxa"/>
             <w:tcBorders>
               <w:top w:val="single" w:sz="4" w:space="0" w:color="C9CCCF"/>
               <w:left w:val="single" w:sz="4" w:space="0" w:color="C9CCCF"/>
@@ -5472,7 +6230,7 @@
         </w:tc>
         <w:tc>
           <w:tcPr>
-            <w:tcW w:w="293" w:type="dxa"/>
+            <w:tcW w:w="740" w:type="dxa"/>
             <w:tcBorders>
               <w:top w:val="single" w:sz="4" w:space="0" w:color="C9CCCF"/>
               <w:left w:val="single" w:sz="4" w:space="0" w:color="C9CCCF"/>
@@ -5501,7 +6259,7 @@
         </w:tc>
         <w:tc>
           <w:tcPr>
-            <w:tcW w:w="293" w:type="dxa"/>
+            <w:tcW w:w="740" w:type="dxa"/>
             <w:tcBorders>
               <w:top w:val="single" w:sz="4" w:space="0" w:color="C9CCCF"/>
               <w:left w:val="single" w:sz="4" w:space="0" w:color="C9CCCF"/>
@@ -5530,43 +6288,45 @@
         </w:tc>
         <w:tc>
           <w:tcPr>
-            <w:tcW w:w="1280" w:type="dxa"/>
-            <w:tcBorders>
-              <w:top w:val="single" w:sz="4" w:space="0" w:color="C9CCCF"/>
-              <w:left w:val="single" w:sz="4" w:space="0" w:color="C9CCCF"/>
-              <w:bottom w:val="single" w:sz="4" w:space="0" w:color="C9CCCF"/>
-              <w:right w:val="single" w:sz="4" w:space="0" w:color="C9CCCF"/>
-            </w:tcBorders>
-            <w:tcMar>
-              <w:top w:w="70" w:type="dxa"/>
-              <w:left w:w="100" w:type="dxa"/>
-              <w:bottom w:w="70" w:type="dxa"/>
-              <w:right w:w="100" w:type="dxa"/>
-            </w:tcMar>
-          </w:tcPr>
-          <w:p>
-            <w:pPr>
-              <w:spacing w:line="260" w:lineRule="auto"/>
-            </w:pPr>
-            <w:r>
-              <w:rPr>
-                <w:sz w:val="15"/>
-                <w:szCs w:val="15"/>
-              </w:rPr>
-              <w:t>TekRevol sales ·</w:t>
-            </w:r>
-            <w:r>
-              <w:rPr>
-                <w:sz w:val="15"/>
-                <w:szCs w:val="15"/>
-              </w:rPr>
-              <w:t xml:space="preserve"> Sana</w:t>
-            </w:r>
-          </w:p>
-        </w:tc>
-        <w:tc>
-          <w:tcPr>
-            <w:tcW w:w="2191" w:type="dxa"/>
+            <w:tcW w:w="1117" w:type="dxa"/>
+            <w:tcBorders>
+              <w:top w:val="single" w:sz="4" w:space="0" w:color="C9CCCF"/>
+              <w:left w:val="single" w:sz="4" w:space="0" w:color="C9CCCF"/>
+              <w:bottom w:val="single" w:sz="4" w:space="0" w:color="C9CCCF"/>
+              <w:right w:val="single" w:sz="4" w:space="0" w:color="C9CCCF"/>
+            </w:tcBorders>
+            <w:tcMar>
+              <w:top w:w="70" w:type="dxa"/>
+              <w:left w:w="100" w:type="dxa"/>
+              <w:bottom w:w="70" w:type="dxa"/>
+              <w:right w:w="100" w:type="dxa"/>
+            </w:tcMar>
+          </w:tcPr>
+          <w:p>
+            <w:pPr>
+              <w:spacing w:line="260" w:lineRule="auto"/>
+            </w:pPr>
+            <w:proofErr w:type="spellStart"/>
+            <w:r>
+              <w:rPr>
+                <w:sz w:val="15"/>
+                <w:szCs w:val="15"/>
+              </w:rPr>
+              <w:t>TekRevol</w:t>
+            </w:r>
+            <w:proofErr w:type="spellEnd"/>
+            <w:r>
+              <w:rPr>
+                <w:sz w:val="15"/>
+                <w:szCs w:val="15"/>
+              </w:rPr>
+              <w:t xml:space="preserve"> sales · Sana</w:t>
+            </w:r>
+          </w:p>
+        </w:tc>
+        <w:tc>
+          <w:tcPr>
+            <w:tcW w:w="1742" w:type="dxa"/>
             <w:tcBorders>
               <w:top w:val="single" w:sz="4" w:space="0" w:color="C9CCCF"/>
               <w:left w:val="single" w:sz="4" w:space="0" w:color="C9CCCF"/>
@@ -5633,11 +6393,9 @@
           <w:sz w:val="17"/>
           <w:szCs w:val="17"/>
         </w:rPr>
-        <w:t>/lp/healthcare-ai-operations</w:t>
-      </w:r>
-      <w:r>
-        <w:t xml:space="preserve"> (noindex). Later this can become the planned </w:t>
-      </w:r>
+        <w:t>/</w:t>
+      </w:r>
+      <w:proofErr w:type="spellStart"/>
       <w:r>
         <w:rPr>
           <w:rFonts w:ascii="JetBrains Mono" w:eastAsia="JetBrains Mono" w:hAnsi="JetBrains Mono" w:cs="JetBrains Mono"/>
@@ -5645,6 +6403,36 @@
           <w:sz w:val="17"/>
           <w:szCs w:val="17"/>
         </w:rPr>
+        <w:t>lp</w:t>
+      </w:r>
+      <w:proofErr w:type="spellEnd"/>
+      <w:r>
+        <w:rPr>
+          <w:rFonts w:ascii="JetBrains Mono" w:eastAsia="JetBrains Mono" w:hAnsi="JetBrains Mono" w:cs="JetBrains Mono"/>
+          <w:color w:val="5E6166"/>
+          <w:sz w:val="17"/>
+          <w:szCs w:val="17"/>
+        </w:rPr>
+        <w:t>/healthcare-ai-operations</w:t>
+      </w:r>
+      <w:r>
+        <w:t xml:space="preserve"> (</w:t>
+      </w:r>
+      <w:proofErr w:type="spellStart"/>
+      <w:r>
+        <w:t>noindex</w:t>
+      </w:r>
+      <w:proofErr w:type="spellEnd"/>
+      <w:r>
+        <w:t xml:space="preserve">). Later this can become the planned </w:t>
+      </w:r>
+      <w:r>
+        <w:rPr>
+          <w:rFonts w:ascii="JetBrains Mono" w:eastAsia="JetBrains Mono" w:hAnsi="JetBrains Mono" w:cs="JetBrains Mono"/>
+          <w:color w:val="5E6166"/>
+          <w:sz w:val="17"/>
+          <w:szCs w:val="17"/>
+        </w:rPr>
         <w:t>/home-based-care</w:t>
       </w:r>
       <w:r>
@@ -5656,7 +6444,23 @@
         <w:spacing w:after="120" w:line="300" w:lineRule="auto"/>
       </w:pPr>
       <w:r>
-        <w:t>Copy follows TekRevol voice: plain, ICP words, no em dashes, no rivals or AI tool names, approved claims only.</w:t>
+        <w:t xml:space="preserve">Copy follows </w:t>
+      </w:r>
+      <w:proofErr w:type="spellStart"/>
+      <w:r>
+        <w:t>TekRevol</w:t>
+      </w:r>
+      <w:proofErr w:type="spellEnd"/>
+      <w:r>
+        <w:t xml:space="preserve"> voice: plain, ICP words, no </w:t>
+      </w:r>
+      <w:proofErr w:type="spellStart"/>
+      <w:r>
+        <w:t>em</w:t>
+      </w:r>
+      <w:proofErr w:type="spellEnd"/>
+      <w:r>
+        <w:t xml:space="preserve"> dashes, no rivals or AI tool names, approved claims only.</w:t>
       </w:r>
     </w:p>
     <w:p>
@@ -5696,14 +6500,7 @@
           <w:b/>
           <w:bCs/>
         </w:rPr>
-        <w:t>AI automation for home health and clinic ope</w:t>
-      </w:r>
-      <w:r>
-        <w:rPr>
-          <w:b/>
-          <w:bCs/>
-        </w:rPr>
-        <w:t>rations</w:t>
+        <w:t>AI automation for home health and clinic operations</w:t>
       </w:r>
     </w:p>
     <w:p>
@@ -5749,10 +6546,8 @@
         <w:spacing w:after="70" w:line="290" w:lineRule="auto"/>
       </w:pPr>
       <w:r>
-        <w:t>Under the button: Free 30-minute review. You leave with 3 workflows to automate f</w:t>
-      </w:r>
-      <w:r>
-        <w:t>irst.</w:t>
+        <w:lastRenderedPageBreak/>
+        <w:t>Under the button: Free 30-minute review. You leave with 3 workflows to automate first.</w:t>
       </w:r>
     </w:p>
     <w:p>
@@ -5812,10 +6607,7 @@
         <w:t>How it works</w:t>
       </w:r>
       <w:r>
-        <w:t xml:space="preserve"> (3 ste</w:t>
-      </w:r>
-      <w:r>
-        <w:t>ps, Strata Method language): Explore your workflows → agree the Ship Line (what goes live first) → ship and measure.</w:t>
+        <w:t xml:space="preserve"> (3 steps, Strata Method language): Explore your workflows → agree the Ship Line (what goes live first) → ship and measure.</w:t>
       </w:r>
     </w:p>
     <w:p>
@@ -5835,7 +6627,15 @@
         <w:t>Healthcare proof:</w:t>
       </w:r>
       <w:r>
-        <w:t xml:space="preserve"> MiloCare and Nurse Practitioners as short cases (problem, what we built, outcome). </w:t>
+        <w:t xml:space="preserve"> </w:t>
+      </w:r>
+      <w:proofErr w:type="spellStart"/>
+      <w:r>
+        <w:t>MiloCare</w:t>
+      </w:r>
+      <w:proofErr w:type="spellEnd"/>
+      <w:r>
+        <w:t xml:space="preserve"> and Nurse Practitioners as short cases (problem, what we built, outcome). </w:t>
       </w:r>
       <w:r>
         <w:rPr>
@@ -5847,34 +6647,9 @@
           <w:szCs w:val="14"/>
           <w:shd w:val="clear" w:color="auto" w:fill="FFE8E0"/>
         </w:rPr>
-        <w:t xml:space="preserve"> NEEDS DATA </w:t>
-      </w:r>
-      <w:r>
-        <w:t xml:space="preserve"> TekRevol has to supply re</w:t>
-      </w:r>
-      <w:r>
-        <w:t>al outcome numbers. If they can't, show scope and timeline, never invented results.</w:t>
-      </w:r>
-    </w:p>
-    <w:p>
-      <w:pPr>
-        <w:pStyle w:val="ListParagraph"/>
-        <w:numPr>
-          <w:ilvl w:val="0"/>
-          <w:numId w:val="3"/>
-        </w:numPr>
-        <w:spacing w:after="80" w:line="290" w:lineRule="auto"/>
-      </w:pPr>
-      <w:r>
-        <w:rPr>
-          <w:b/>
-          <w:bCs/>
-        </w:rPr>
-        <w:t>Compliance block for the approver:</w:t>
-      </w:r>
-      <w:r>
-        <w:t xml:space="preserve"> HIPAA-aligned SDLC, BAA available </w:t>
-      </w:r>
+        <w:t xml:space="preserve"> NEEDS </w:t>
+      </w:r>
+      <w:proofErr w:type="gramStart"/>
       <w:r>
         <w:rPr>
           <w:rFonts w:ascii="JetBrains Mono" w:eastAsia="JetBrains Mono" w:hAnsi="JetBrains Mono" w:cs="JetBrains Mono"/>
@@ -5885,10 +6660,19 @@
           <w:szCs w:val="14"/>
           <w:shd w:val="clear" w:color="auto" w:fill="FFE8E0"/>
         </w:rPr>
-        <w:t xml:space="preserve"> NEEDS DATA </w:t>
-      </w:r>
-      <w:r>
-        <w:t xml:space="preserve"> (confirm), PHI handling, private LLMs with PII redaction, access controls and audit logs.</w:t>
+        <w:t xml:space="preserve">DATA </w:t>
+      </w:r>
+      <w:r>
+        <w:t xml:space="preserve"> </w:t>
+      </w:r>
+      <w:proofErr w:type="spellStart"/>
+      <w:r>
+        <w:t>TekRevol</w:t>
+      </w:r>
+      <w:proofErr w:type="spellEnd"/>
+      <w:proofErr w:type="gramEnd"/>
+      <w:r>
+        <w:t xml:space="preserve"> has to supply real outcome numbers. If they can't, show scope and timeline, never invented results.</w:t>
       </w:r>
     </w:p>
     <w:p>
@@ -5905,10 +6689,42 @@
           <w:b/>
           <w:bCs/>
         </w:rPr>
-        <w:t>FAQ</w:t>
-      </w:r>
-      <w:r>
-        <w:t xml:space="preserve"> (answer-first, ChatGPT users expect this): What does it cost? How long until something is live? Does it work with our EHR? Is it HIPAA compliant? Do we need an in-house tech team?</w:t>
+        <w:t>Compliance block for the approver:</w:t>
+      </w:r>
+      <w:r>
+        <w:t xml:space="preserve"> HIPAA-aligned SDLC, BAA </w:t>
+      </w:r>
+      <w:proofErr w:type="gramStart"/>
+      <w:r>
+        <w:t xml:space="preserve">available </w:t>
+      </w:r>
+      <w:r>
+        <w:rPr>
+          <w:rFonts w:ascii="JetBrains Mono" w:eastAsia="JetBrains Mono" w:hAnsi="JetBrains Mono" w:cs="JetBrains Mono"/>
+          <w:b/>
+          <w:bCs/>
+          <w:color w:val="C23A00"/>
+          <w:sz w:val="14"/>
+          <w:szCs w:val="14"/>
+          <w:shd w:val="clear" w:color="auto" w:fill="FFE8E0"/>
+        </w:rPr>
+        <w:t xml:space="preserve"> NEEDS</w:t>
+      </w:r>
+      <w:proofErr w:type="gramEnd"/>
+      <w:r>
+        <w:rPr>
+          <w:rFonts w:ascii="JetBrains Mono" w:eastAsia="JetBrains Mono" w:hAnsi="JetBrains Mono" w:cs="JetBrains Mono"/>
+          <w:b/>
+          <w:bCs/>
+          <w:color w:val="C23A00"/>
+          <w:sz w:val="14"/>
+          <w:szCs w:val="14"/>
+          <w:shd w:val="clear" w:color="auto" w:fill="FFE8E0"/>
+        </w:rPr>
+        <w:t xml:space="preserve"> DATA </w:t>
+      </w:r>
+      <w:r>
+        <w:t xml:space="preserve"> (confirm), PHI handling, private LLMs with PII redaction, access controls and audit logs.</w:t>
       </w:r>
     </w:p>
     <w:p>
@@ -5925,13 +6741,38 @@
           <w:b/>
           <w:bCs/>
         </w:rPr>
+        <w:t>FAQ</w:t>
+      </w:r>
+      <w:r>
+        <w:t xml:space="preserve"> (answer-first, </w:t>
+      </w:r>
+      <w:proofErr w:type="spellStart"/>
+      <w:r>
+        <w:t>ChatGPT</w:t>
+      </w:r>
+      <w:proofErr w:type="spellEnd"/>
+      <w:r>
+        <w:t xml:space="preserve"> users expect this): What does it cost? How long until something is live? Does it work with our EHR? Is it HIPAA compliant? Do we need an in-house tech team?</w:t>
+      </w:r>
+    </w:p>
+    <w:p>
+      <w:pPr>
+        <w:pStyle w:val="ListParagraph"/>
+        <w:numPr>
+          <w:ilvl w:val="0"/>
+          <w:numId w:val="3"/>
+        </w:numPr>
+        <w:spacing w:after="80" w:line="290" w:lineRule="auto"/>
+      </w:pPr>
+      <w:r>
+        <w:rPr>
+          <w:b/>
+          <w:bCs/>
+        </w:rPr>
         <w:t>Repeat form</w:t>
       </w:r>
       <w:r>
-        <w:t xml:space="preserve"> at the bottom. No blog block, no industries grid, no tech st</w:t>
-      </w:r>
-      <w:r>
-        <w:t>ack, no top nav.</w:t>
+        <w:t xml:space="preserve"> at the bottom. No blog block, no industries grid, no tech stack, no top nav.</w:t>
       </w:r>
     </w:p>
     <w:p>
@@ -5950,7 +6791,27 @@
           <w:sz w:val="34"/>
           <w:szCs w:val="34"/>
         </w:rPr>
-        <w:t>Ad-side changes (after tracking + page are live)</w:t>
+        <w:t xml:space="preserve">Ad-side changes (after tracking + page </w:t>
+      </w:r>
+      <w:proofErr w:type="gramStart"/>
+      <w:r>
+        <w:rPr>
+          <w:rFonts w:ascii="Funnel Display" w:eastAsia="Funnel Display" w:hAnsi="Funnel Display" w:cs="Funnel Display"/>
+          <w:color w:val="1D1E21"/>
+          <w:sz w:val="34"/>
+          <w:szCs w:val="34"/>
+        </w:rPr>
+        <w:t>are</w:t>
+      </w:r>
+      <w:proofErr w:type="gramEnd"/>
+      <w:r>
+        <w:rPr>
+          <w:rFonts w:ascii="Funnel Display" w:eastAsia="Funnel Display" w:hAnsi="Funnel Display" w:cs="Funnel Display"/>
+          <w:color w:val="1D1E21"/>
+          <w:sz w:val="34"/>
+          <w:szCs w:val="34"/>
+        </w:rPr>
+        <w:t xml:space="preserve"> live)</w:t>
       </w:r>
     </w:p>
     <w:p>
@@ -5970,10 +6831,7 @@
         <w:t>Split healthcare into 2 ad groups</w:t>
       </w:r>
       <w:r>
-        <w:t xml:space="preserve"> with their own context hints and page variants: (a) home health and home care agencies, (b) clinics and revenue cycle. The current hint mixes digital health</w:t>
-      </w:r>
-      <w:r>
-        <w:t xml:space="preserve"> founders with RCM leaders.</w:t>
+        <w:t xml:space="preserve"> with their own context hints and page variants: (a) home health and home care agencies, (b) clinics and revenue cycle. The current hint mixes digital health founders with RCM leaders.</w:t>
       </w:r>
     </w:p>
     <w:p>
@@ -6013,10 +6871,7 @@
         <w:t>Point Enterprise and AI Agents traffic at their own focused pages later.</w:t>
       </w:r>
       <w:r>
-        <w:t xml:space="preserve"> AI Agents had the best CTR (1.64% on the "Build </w:t>
-      </w:r>
-      <w:r>
-        <w:t>AI Agents" ad), so it's the next candidate.</w:t>
+        <w:t xml:space="preserve"> AI Agents had the best CTR (1.64% on the "Build AI Agents" ad), so it's the next candidate.</w:t>
       </w:r>
     </w:p>
     <w:p>
@@ -6056,10 +6911,15 @@
         <w:t>Don't relaunch on the old page.</w:t>
       </w:r>
       <w:r>
-        <w:t xml:space="preserve"> Every click there costs ~$4.50</w:t>
-      </w:r>
-      <w:r>
-        <w:t xml:space="preserve"> at ~1% conversion.</w:t>
+        <w:t xml:space="preserve"> Every click </w:t>
+      </w:r>
+      <w:proofErr w:type="gramStart"/>
+      <w:r>
+        <w:t>there</w:t>
+      </w:r>
+      <w:proofErr w:type="gramEnd"/>
+      <w:r>
+        <w:t xml:space="preserve"> costs ~$4.50 at ~1% conversion.</w:t>
       </w:r>
     </w:p>
     <w:p>
@@ -6259,7 +7119,23 @@
                 <w:sz w:val="18"/>
                 <w:szCs w:val="18"/>
               </w:rPr>
-              <w:t>Tracking (action 1) · pull the lost lead from CRM (action 5) · Sana drafts page copy · TekRevol confirms case outcomes + BAA</w:t>
+              <w:t xml:space="preserve">Tracking (action 1) · pull the lost lead from CRM (action 5) · Sana drafts page copy · </w:t>
+            </w:r>
+            <w:proofErr w:type="spellStart"/>
+            <w:r>
+              <w:rPr>
+                <w:sz w:val="18"/>
+                <w:szCs w:val="18"/>
+              </w:rPr>
+              <w:t>TekRevol</w:t>
+            </w:r>
+            <w:proofErr w:type="spellEnd"/>
+            <w:r>
+              <w:rPr>
+                <w:sz w:val="18"/>
+                <w:szCs w:val="18"/>
+              </w:rPr>
+              <w:t xml:space="preserve"> confirms case outcomes + BAA</w:t>
             </w:r>
           </w:p>
         </w:tc>
@@ -6353,38 +7229,71 @@
                 <w:sz w:val="18"/>
                 <w:szCs w:val="18"/>
               </w:rPr>
-              <w:t>Design + build the landing page and thank-you page with a calendar; QA on mobile; rerun PageSpeed (target mobile LCP &lt; 2.5 s)</w:t>
-            </w:r>
-          </w:p>
-        </w:tc>
-        <w:tc>
-          <w:tcPr>
-            <w:tcW w:w="4160" w:type="dxa"/>
-            <w:tcBorders>
-              <w:top w:val="single" w:sz="4" w:space="0" w:color="C9CCCF"/>
-              <w:left w:val="single" w:sz="4" w:space="0" w:color="C9CCCF"/>
-              <w:bottom w:val="single" w:sz="4" w:space="0" w:color="C9CCCF"/>
-              <w:right w:val="single" w:sz="4" w:space="0" w:color="C9CCCF"/>
-            </w:tcBorders>
-            <w:shd w:val="clear" w:color="auto" w:fill="F3F4F4"/>
-            <w:tcMar>
-              <w:top w:w="70" w:type="dxa"/>
-              <w:left w:w="100" w:type="dxa"/>
-              <w:bottom w:w="70" w:type="dxa"/>
-              <w:right w:w="100" w:type="dxa"/>
-            </w:tcMar>
-          </w:tcPr>
-          <w:p>
-            <w:pPr>
-              <w:spacing w:line="260" w:lineRule="auto"/>
-            </w:pPr>
+              <w:t xml:space="preserve">Design + build the landing page and thank-you page with a calendar; QA on mobile; rerun </w:t>
+            </w:r>
+            <w:proofErr w:type="spellStart"/>
             <w:r>
               <w:rPr>
                 <w:sz w:val="18"/>
                 <w:szCs w:val="18"/>
               </w:rPr>
-              <w:t xml:space="preserve">Page approved by TekRevol; all forms fire </w:t>
-            </w:r>
+              <w:t>PageSpeed</w:t>
+            </w:r>
+            <w:proofErr w:type="spellEnd"/>
+            <w:r>
+              <w:rPr>
+                <w:sz w:val="18"/>
+                <w:szCs w:val="18"/>
+              </w:rPr>
+              <w:t xml:space="preserve"> (target mobile LCP &lt; 2.5 s)</w:t>
+            </w:r>
+          </w:p>
+        </w:tc>
+        <w:tc>
+          <w:tcPr>
+            <w:tcW w:w="4160" w:type="dxa"/>
+            <w:tcBorders>
+              <w:top w:val="single" w:sz="4" w:space="0" w:color="C9CCCF"/>
+              <w:left w:val="single" w:sz="4" w:space="0" w:color="C9CCCF"/>
+              <w:bottom w:val="single" w:sz="4" w:space="0" w:color="C9CCCF"/>
+              <w:right w:val="single" w:sz="4" w:space="0" w:color="C9CCCF"/>
+            </w:tcBorders>
+            <w:shd w:val="clear" w:color="auto" w:fill="F3F4F4"/>
+            <w:tcMar>
+              <w:top w:w="70" w:type="dxa"/>
+              <w:left w:w="100" w:type="dxa"/>
+              <w:bottom w:w="70" w:type="dxa"/>
+              <w:right w:w="100" w:type="dxa"/>
+            </w:tcMar>
+          </w:tcPr>
+          <w:p>
+            <w:pPr>
+              <w:spacing w:line="260" w:lineRule="auto"/>
+            </w:pPr>
+            <w:r>
+              <w:rPr>
+                <w:sz w:val="18"/>
+                <w:szCs w:val="18"/>
+              </w:rPr>
+              <w:t xml:space="preserve">Page approved by </w:t>
+            </w:r>
+            <w:proofErr w:type="spellStart"/>
+            <w:r>
+              <w:rPr>
+                <w:sz w:val="18"/>
+                <w:szCs w:val="18"/>
+              </w:rPr>
+              <w:t>TekRevol</w:t>
+            </w:r>
+            <w:proofErr w:type="spellEnd"/>
+            <w:r>
+              <w:rPr>
+                <w:sz w:val="18"/>
+                <w:szCs w:val="18"/>
+              </w:rPr>
+              <w:t xml:space="preserve">; all forms fire </w:t>
+            </w:r>
+            <w:proofErr w:type="spellStart"/>
             <w:r>
               <w:rPr>
                 <w:rFonts w:ascii="JetBrains Mono" w:eastAsia="JetBrains Mono" w:hAnsi="JetBrains Mono" w:cs="JetBrains Mono"/>
@@ -6394,6 +7303,7 @@
               </w:rPr>
               <w:t>lead_created</w:t>
             </w:r>
+            <w:proofErr w:type="spellEnd"/>
           </w:p>
         </w:tc>
       </w:tr>
@@ -6426,6 +7336,7 @@
                 <w:sz w:val="18"/>
                 <w:szCs w:val="18"/>
               </w:rPr>
+              <w:lastRenderedPageBreak/>
               <w:t>4–5</w:t>
             </w:r>
           </w:p>
@@ -6620,7 +7531,11 @@
         <w:t>Why this can reach 5%</w:t>
       </w:r>
       <w:r>
-        <w:t xml:space="preserve"> (</w:t>
+        <w:t xml:space="preserve"> </w:t>
+      </w:r>
+      <w:proofErr w:type="gramStart"/>
+      <w:r>
+        <w:t>(</w:t>
       </w:r>
       <w:r>
         <w:rPr>
@@ -6632,13 +7547,23 @@
           <w:szCs w:val="14"/>
           <w:shd w:val="clear" w:color="auto" w:fill="E3EEF8"/>
         </w:rPr>
-        <w:t xml:space="preserve"> INFERRED </w:t>
-      </w:r>
-      <w:r>
-        <w:t>): the healthcare ad group already brings relevant, intent-rich clicks at a stable CPC. The losses happen after the click: the message breaks, there's nothing low-commitment to say yes to, and the form is buried and heavy. Each of these is a known conversi</w:t>
-      </w:r>
-      <w:r>
-        <w:t>on killer, and each is fixed above. Dedicated, message-matched B2B service pages with a light offer typically convert in the 3–8% range. Hitting 5% depends on the offer landing, so the week 4–5 checkpoint has a fallback offer ready.</w:t>
+        <w:t xml:space="preserve"> INFERRED</w:t>
+      </w:r>
+      <w:proofErr w:type="gramEnd"/>
+      <w:r>
+        <w:rPr>
+          <w:rFonts w:ascii="JetBrains Mono" w:eastAsia="JetBrains Mono" w:hAnsi="JetBrains Mono" w:cs="JetBrains Mono"/>
+          <w:b/>
+          <w:bCs/>
+          <w:color w:val="1F5A8A"/>
+          <w:sz w:val="14"/>
+          <w:szCs w:val="14"/>
+          <w:shd w:val="clear" w:color="auto" w:fill="E3EEF8"/>
+        </w:rPr>
+        <w:t xml:space="preserve"> </w:t>
+      </w:r>
+      <w:r>
+        <w:t>): the healthcare ad group already brings relevant, intent-rich clicks at a stable CPC. The losses happen after the click: the message breaks, there's nothing low-commitment to say yes to, and the form is buried and heavy. Each of these is a known conversion killer, and each is fixed above. Dedicated, message-matched B2B service pages with a light offer typically convert in the 3–8% range. Hitting 5% depends on the offer landing, so the week 4–5 checkpoint has a fallback offer ready.</w:t>
       </w:r>
     </w:p>
     <w:p>
@@ -6653,10 +7578,15 @@
         <w:t>Note on sample size:</w:t>
       </w:r>
       <w:r>
-        <w:t xml:space="preserve"> at</w:t>
-      </w:r>
-      <w:r>
-        <w:t xml:space="preserve"> 5%, 100 clicks gives about 5 leads. Don't call a winner or loser before ~100 clicks per variant (~$450). Below that, a single lead swings the rate by a full percentage point.</w:t>
+        <w:t xml:space="preserve"> at 5%, 100 clicks </w:t>
+      </w:r>
+      <w:proofErr w:type="gramStart"/>
+      <w:r>
+        <w:t>gives</w:t>
+      </w:r>
+      <w:proofErr w:type="gramEnd"/>
+      <w:r>
+        <w:t xml:space="preserve"> about 5 leads. Don't call a winner or loser before ~100 clicks per variant (~$450). Below that, a single lead swings the rate by a full percentage point.</w:t>
       </w:r>
     </w:p>
     <w:p>
@@ -6860,14 +7790,36 @@
                 <w:sz w:val="18"/>
                 <w:szCs w:val="18"/>
               </w:rPr>
-              <w:t xml:space="preserve">Fix the old healthcare page anyway (organic </w:t>
-            </w:r>
+              <w:t>Fix the old healthcare page anyway (organic traffic): "100+" → "800+", typo, duplicate bullets, remove VR/blockchain copy, healthcare testimonials</w:t>
+            </w:r>
+          </w:p>
+        </w:tc>
+        <w:tc>
+          <w:tcPr>
+            <w:tcW w:w="788" w:type="dxa"/>
+            <w:tcBorders>
+              <w:top w:val="single" w:sz="4" w:space="0" w:color="C9CCCF"/>
+              <w:left w:val="single" w:sz="4" w:space="0" w:color="C9CCCF"/>
+              <w:bottom w:val="single" w:sz="4" w:space="0" w:color="C9CCCF"/>
+              <w:right w:val="single" w:sz="4" w:space="0" w:color="C9CCCF"/>
+            </w:tcBorders>
+            <w:tcMar>
+              <w:top w:w="70" w:type="dxa"/>
+              <w:left w:w="100" w:type="dxa"/>
+              <w:bottom w:w="70" w:type="dxa"/>
+              <w:right w:w="100" w:type="dxa"/>
+            </w:tcMar>
+          </w:tcPr>
+          <w:p>
+            <w:pPr>
+              <w:spacing w:line="260" w:lineRule="auto"/>
+            </w:pPr>
             <w:r>
               <w:rPr>
                 <w:sz w:val="18"/>
                 <w:szCs w:val="18"/>
               </w:rPr>
-              <w:t>traffic): "100+" → "800+", typo, duplicate bullets, remove VR/blockchain copy, healthcare testimonials</w:t>
+              <w:t>M</w:t>
             </w:r>
           </w:p>
         </w:tc>
@@ -6896,65 +7848,45 @@
                 <w:sz w:val="18"/>
                 <w:szCs w:val="18"/>
               </w:rPr>
-              <w:t>M</w:t>
-            </w:r>
-          </w:p>
-        </w:tc>
-        <w:tc>
-          <w:tcPr>
-            <w:tcW w:w="788" w:type="dxa"/>
-            <w:tcBorders>
-              <w:top w:val="single" w:sz="4" w:space="0" w:color="C9CCCF"/>
-              <w:left w:val="single" w:sz="4" w:space="0" w:color="C9CCCF"/>
-              <w:bottom w:val="single" w:sz="4" w:space="0" w:color="C9CCCF"/>
-              <w:right w:val="single" w:sz="4" w:space="0" w:color="C9CCCF"/>
-            </w:tcBorders>
-            <w:tcMar>
-              <w:top w:w="70" w:type="dxa"/>
-              <w:left w:w="100" w:type="dxa"/>
-              <w:bottom w:w="70" w:type="dxa"/>
-              <w:right w:w="100" w:type="dxa"/>
-            </w:tcMar>
-          </w:tcPr>
-          <w:p>
-            <w:pPr>
-              <w:spacing w:line="260" w:lineRule="auto"/>
-            </w:pPr>
+              <w:t>L</w:t>
+            </w:r>
+          </w:p>
+        </w:tc>
+        <w:tc>
+          <w:tcPr>
+            <w:tcW w:w="1872" w:type="dxa"/>
+            <w:tcBorders>
+              <w:top w:val="single" w:sz="4" w:space="0" w:color="C9CCCF"/>
+              <w:left w:val="single" w:sz="4" w:space="0" w:color="C9CCCF"/>
+              <w:bottom w:val="single" w:sz="4" w:space="0" w:color="C9CCCF"/>
+              <w:right w:val="single" w:sz="4" w:space="0" w:color="C9CCCF"/>
+            </w:tcBorders>
+            <w:tcMar>
+              <w:top w:w="70" w:type="dxa"/>
+              <w:left w:w="100" w:type="dxa"/>
+              <w:bottom w:w="70" w:type="dxa"/>
+              <w:right w:w="100" w:type="dxa"/>
+            </w:tcMar>
+          </w:tcPr>
+          <w:p>
+            <w:pPr>
+              <w:spacing w:line="260" w:lineRule="auto"/>
+            </w:pPr>
+            <w:proofErr w:type="spellStart"/>
             <w:r>
               <w:rPr>
                 <w:sz w:val="18"/>
                 <w:szCs w:val="18"/>
               </w:rPr>
-              <w:t>L</w:t>
-            </w:r>
-          </w:p>
-        </w:tc>
-        <w:tc>
-          <w:tcPr>
-            <w:tcW w:w="1872" w:type="dxa"/>
-            <w:tcBorders>
-              <w:top w:val="single" w:sz="4" w:space="0" w:color="C9CCCF"/>
-              <w:left w:val="single" w:sz="4" w:space="0" w:color="C9CCCF"/>
-              <w:bottom w:val="single" w:sz="4" w:space="0" w:color="C9CCCF"/>
-              <w:right w:val="single" w:sz="4" w:space="0" w:color="C9CCCF"/>
-            </w:tcBorders>
-            <w:tcMar>
-              <w:top w:w="70" w:type="dxa"/>
-              <w:left w:w="100" w:type="dxa"/>
-              <w:bottom w:w="70" w:type="dxa"/>
-              <w:right w:w="100" w:type="dxa"/>
-            </w:tcMar>
-          </w:tcPr>
-          <w:p>
-            <w:pPr>
-              <w:spacing w:line="260" w:lineRule="auto"/>
-            </w:pPr>
+              <w:t>TekRevol</w:t>
+            </w:r>
+            <w:proofErr w:type="spellEnd"/>
             <w:r>
               <w:rPr>
                 <w:sz w:val="18"/>
                 <w:szCs w:val="18"/>
               </w:rPr>
-              <w:t>TekRevol dev · Sana</w:t>
+              <w:t xml:space="preserve"> dev · Sana</w:t>
             </w:r>
           </w:p>
         </w:tc>
@@ -6989,8 +7921,25 @@
                 <w:sz w:val="18"/>
                 <w:szCs w:val="18"/>
               </w:rPr>
-              <w:t xml:space="preserve">Track Tawk chat starts and </w:t>
-            </w:r>
+              <w:t xml:space="preserve">Track </w:t>
+            </w:r>
+            <w:proofErr w:type="spellStart"/>
+            <w:r>
+              <w:rPr>
+                <w:sz w:val="18"/>
+                <w:szCs w:val="18"/>
+              </w:rPr>
+              <w:t>Tawk</w:t>
+            </w:r>
+            <w:proofErr w:type="spellEnd"/>
+            <w:r>
+              <w:rPr>
+                <w:sz w:val="18"/>
+                <w:szCs w:val="18"/>
+              </w:rPr>
+              <w:t xml:space="preserve"> chat starts and </w:t>
+            </w:r>
+            <w:proofErr w:type="spellStart"/>
             <w:r>
               <w:rPr>
                 <w:rFonts w:ascii="JetBrains Mono" w:eastAsia="JetBrains Mono" w:hAnsi="JetBrains Mono" w:cs="JetBrains Mono"/>
@@ -6998,7 +7947,17 @@
                 <w:sz w:val="15"/>
                 <w:szCs w:val="15"/>
               </w:rPr>
-              <w:t>tel:</w:t>
+              <w:t>tel</w:t>
+            </w:r>
+            <w:proofErr w:type="spellEnd"/>
+            <w:r>
+              <w:rPr>
+                <w:rFonts w:ascii="JetBrains Mono" w:eastAsia="JetBrains Mono" w:hAnsi="JetBrains Mono" w:cs="JetBrains Mono"/>
+                <w:color w:val="5E6166"/>
+                <w:sz w:val="15"/>
+                <w:szCs w:val="15"/>
+              </w:rPr>
+              <w:t>:</w:t>
             </w:r>
             <w:r>
               <w:rPr>
@@ -7090,12 +8049,21 @@
             <w:pPr>
               <w:spacing w:line="260" w:lineRule="auto"/>
             </w:pPr>
+            <w:proofErr w:type="spellStart"/>
             <w:r>
               <w:rPr>
                 <w:sz w:val="18"/>
                 <w:szCs w:val="18"/>
               </w:rPr>
-              <w:t>TekRevol dev</w:t>
+              <w:t>TekRevol</w:t>
+            </w:r>
+            <w:proofErr w:type="spellEnd"/>
+            <w:r>
+              <w:rPr>
+                <w:sz w:val="18"/>
+                <w:szCs w:val="18"/>
+              </w:rPr>
+              <w:t xml:space="preserve"> dev</w:t>
             </w:r>
           </w:p>
         </w:tc>
@@ -7147,6 +8115,7 @@
               </w:rPr>
               <w:t xml:space="preserve"> keep context (show "Healthcare project" when </w:t>
             </w:r>
+            <w:proofErr w:type="spellStart"/>
             <w:r>
               <w:rPr>
                 <w:rFonts w:ascii="JetBrains Mono" w:eastAsia="JetBrains Mono" w:hAnsi="JetBrains Mono" w:cs="JetBrains Mono"/>
@@ -7156,6 +8125,7 @@
               </w:rPr>
               <w:t>landing_page</w:t>
             </w:r>
+            <w:proofErr w:type="spellEnd"/>
             <w:r>
               <w:rPr>
                 <w:sz w:val="18"/>
@@ -7243,12 +8213,21 @@
             <w:pPr>
               <w:spacing w:line="260" w:lineRule="auto"/>
             </w:pPr>
+            <w:proofErr w:type="spellStart"/>
             <w:r>
               <w:rPr>
                 <w:sz w:val="18"/>
                 <w:szCs w:val="18"/>
               </w:rPr>
-              <w:t>TekRevol dev</w:t>
+              <w:t>TekRevol</w:t>
+            </w:r>
+            <w:proofErr w:type="spellEnd"/>
+            <w:r>
+              <w:rPr>
+                <w:sz w:val="18"/>
+                <w:szCs w:val="18"/>
+              </w:rPr>
+              <w:t xml:space="preserve"> dev</w:t>
             </w:r>
           </w:p>
         </w:tc>
@@ -7368,12 +8347,21 @@
             <w:pPr>
               <w:spacing w:line="260" w:lineRule="auto"/>
             </w:pPr>
+            <w:proofErr w:type="spellStart"/>
             <w:r>
               <w:rPr>
                 <w:sz w:val="18"/>
                 <w:szCs w:val="18"/>
               </w:rPr>
-              <w:t>TekRevol / Sana</w:t>
+              <w:t>TekRevol</w:t>
+            </w:r>
+            <w:proofErr w:type="spellEnd"/>
+            <w:r>
+              <w:rPr>
+                <w:sz w:val="18"/>
+                <w:szCs w:val="18"/>
+              </w:rPr>
+              <w:t xml:space="preserve"> / Sana</w:t>
             </w:r>
           </w:p>
         </w:tc>
@@ -7674,6 +8662,7 @@
       <w:r>
         <w:t xml:space="preserve">GA4 engagement and scroll depth for </w:t>
       </w:r>
+      <w:proofErr w:type="spellStart"/>
       <w:r>
         <w:rPr>
           <w:rFonts w:ascii="JetBrains Mono" w:eastAsia="JetBrains Mono" w:hAnsi="JetBrains Mono" w:cs="JetBrains Mono"/>
@@ -7681,8 +8670,29 @@
           <w:sz w:val="17"/>
           <w:szCs w:val="17"/>
         </w:rPr>
-        <w:t>utm_source=chatgpt</w:t>
-      </w:r>
+        <w:t>utm_source</w:t>
+      </w:r>
+      <w:proofErr w:type="spellEnd"/>
+      <w:r>
+        <w:rPr>
+          <w:rFonts w:ascii="JetBrains Mono" w:eastAsia="JetBrains Mono" w:hAnsi="JetBrains Mono" w:cs="JetBrains Mono"/>
+          <w:color w:val="5E6166"/>
+          <w:sz w:val="17"/>
+          <w:szCs w:val="17"/>
+        </w:rPr>
+        <w:t>=</w:t>
+      </w:r>
+      <w:proofErr w:type="spellStart"/>
+      <w:r>
+        <w:rPr>
+          <w:rFonts w:ascii="JetBrains Mono" w:eastAsia="JetBrains Mono" w:hAnsi="JetBrains Mono" w:cs="JetBrains Mono"/>
+          <w:color w:val="5E6166"/>
+          <w:sz w:val="17"/>
+          <w:szCs w:val="17"/>
+        </w:rPr>
+        <w:t>chatgpt</w:t>
+      </w:r>
+      <w:proofErr w:type="spellEnd"/>
       <w:r>
         <w:t xml:space="preserve"> sessions</w:t>
       </w:r>
@@ -7697,7 +8707,15 @@
         <w:spacing w:after="70" w:line="290" w:lineRule="auto"/>
       </w:pPr>
       <w:r>
-        <w:t>Mobile PageSpeed / Core Web Vitals (API quota hit; rerun)</w:t>
+        <w:t xml:space="preserve">Mobile </w:t>
+      </w:r>
+      <w:proofErr w:type="spellStart"/>
+      <w:r>
+        <w:t>PageSpeed</w:t>
+      </w:r>
+      <w:proofErr w:type="spellEnd"/>
+      <w:r>
+        <w:t xml:space="preserve"> / Core Web Vitals (API quota hit; rerun)</w:t>
       </w:r>
     </w:p>
     <w:p>
@@ -7710,10 +8728,24 @@
         <w:spacing w:after="70" w:line="290" w:lineRule="auto"/>
       </w:pPr>
       <w:r>
-        <w:t xml:space="preserve">Real outcome numbers for the MiloCare and Nurse </w:t>
-      </w:r>
-      <w:r>
-        <w:t>Practitioners cases; whether TekRevol signs BAAs</w:t>
+        <w:lastRenderedPageBreak/>
+        <w:t xml:space="preserve">Real outcome numbers for the </w:t>
+      </w:r>
+      <w:proofErr w:type="spellStart"/>
+      <w:r>
+        <w:t>MiloCare</w:t>
+      </w:r>
+      <w:proofErr w:type="spellEnd"/>
+      <w:r>
+        <w:t xml:space="preserve"> and Nurse Practitioners cases; whether </w:t>
+      </w:r>
+      <w:proofErr w:type="spellStart"/>
+      <w:r>
+        <w:t>TekRevol</w:t>
+      </w:r>
+      <w:proofErr w:type="spellEnd"/>
+      <w:r>
+        <w:t xml:space="preserve"> signs BAAs</w:t>
       </w:r>
     </w:p>
     <w:p>
@@ -7758,7 +8790,23 @@
         <w:spacing w:after="80" w:line="290" w:lineRule="auto"/>
       </w:pPr>
       <w:r>
-        <w:t>Share this audit with TekRevol; get sign-off to keep the campaign paused until tracking + new page are live</w:t>
+        <w:t xml:space="preserve">Share this audit with </w:t>
+      </w:r>
+      <w:proofErr w:type="spellStart"/>
+      <w:r>
+        <w:t>TekRevol</w:t>
+      </w:r>
+      <w:proofErr w:type="spellEnd"/>
+      <w:r>
+        <w:t xml:space="preserve">; get sign-off to keep the campaign paused until tracking + new page </w:t>
+      </w:r>
+      <w:proofErr w:type="gramStart"/>
+      <w:r>
+        <w:t>are</w:t>
+      </w:r>
+      <w:proofErr w:type="gramEnd"/>
+      <w:r>
+        <w:t xml:space="preserve"> live</w:t>
       </w:r>
     </w:p>
     <w:p>
@@ -7770,12 +8818,23 @@
         </w:numPr>
         <w:spacing w:after="80" w:line="290" w:lineRule="auto"/>
       </w:pPr>
-      <w:r>
-        <w:t>TekRevol dev: in</w:t>
-      </w:r>
-      <w:r>
-        <w:t xml:space="preserve">stall OpenAI pixel via GTM, fire </w:t>
-      </w:r>
+      <w:proofErr w:type="spellStart"/>
+      <w:r>
+        <w:t>TekRevol</w:t>
+      </w:r>
+      <w:proofErr w:type="spellEnd"/>
+      <w:r>
+        <w:t xml:space="preserve"> dev: install </w:t>
+      </w:r>
+      <w:proofErr w:type="spellStart"/>
+      <w:r>
+        <w:t>OpenAI</w:t>
+      </w:r>
+      <w:proofErr w:type="spellEnd"/>
+      <w:r>
+        <w:t xml:space="preserve"> pixel via GTM, fire </w:t>
+      </w:r>
+      <w:proofErr w:type="spellStart"/>
       <w:r>
         <w:rPr>
           <w:rFonts w:ascii="JetBrains Mono" w:eastAsia="JetBrains Mono" w:hAnsi="JetBrains Mono" w:cs="JetBrains Mono"/>
@@ -7785,9 +8844,11 @@
         </w:rPr>
         <w:t>lead_created</w:t>
       </w:r>
+      <w:proofErr w:type="spellEnd"/>
       <w:r>
         <w:t xml:space="preserve"> on all form successes, link to campaign, add </w:t>
       </w:r>
+      <w:proofErr w:type="spellStart"/>
       <w:r>
         <w:rPr>
           <w:rFonts w:ascii="JetBrains Mono" w:eastAsia="JetBrains Mono" w:hAnsi="JetBrains Mono" w:cs="JetBrains Mono"/>
@@ -7797,6 +8858,7 @@
         </w:rPr>
         <w:t>utm_content</w:t>
       </w:r>
+      <w:proofErr w:type="spellEnd"/>
       <w:r>
         <w:t xml:space="preserve"> field</w:t>
       </w:r>
@@ -7810,8 +8872,13 @@
         </w:numPr>
         <w:spacing w:after="80" w:line="290" w:lineRule="auto"/>
       </w:pPr>
-      <w:r>
-        <w:t>TekRevol sales: send the lost healthcare lead's CRM details</w:t>
+      <w:proofErr w:type="spellStart"/>
+      <w:r>
+        <w:t>TekRevol</w:t>
+      </w:r>
+      <w:proofErr w:type="spellEnd"/>
+      <w:r>
+        <w:t xml:space="preserve"> sales: send the lost healthcare lead's CRM details</w:t>
       </w:r>
     </w:p>
     <w:p>
@@ -7823,8 +8890,13 @@
         </w:numPr>
         <w:spacing w:after="80" w:line="290" w:lineRule="auto"/>
       </w:pPr>
-      <w:r>
-        <w:t>TekRevol: confirm healthcare case outcomes and BAA availability</w:t>
+      <w:proofErr w:type="spellStart"/>
+      <w:r>
+        <w:t>TekRevol</w:t>
+      </w:r>
+      <w:proofErr w:type="spellEnd"/>
+      <w:r>
+        <w:t>: confirm healthcare case outcomes and BAA availability</w:t>
       </w:r>
     </w:p>
     <w:p>
@@ -7850,7 +8922,15 @@
         <w:spacing w:after="80" w:line="290" w:lineRule="auto"/>
       </w:pPr>
       <w:r>
-        <w:t>Rerun mobile PageSpeed on the current page and on the new page before launch</w:t>
+        <w:t xml:space="preserve">Rerun mobile </w:t>
+      </w:r>
+      <w:proofErr w:type="spellStart"/>
+      <w:r>
+        <w:t>PageSpeed</w:t>
+      </w:r>
+      <w:proofErr w:type="spellEnd"/>
+      <w:r>
+        <w:t xml:space="preserve"> on the current page and on the new page before launch</w:t>
       </w:r>
     </w:p>
     <w:p>
@@ -7902,6 +8982,7 @@
     <w:pPr>
       <w:jc w:val="right"/>
     </w:pPr>
+    <w:proofErr w:type="spellStart"/>
     <w:r>
       <w:rPr>
         <w:rFonts w:ascii="JetBrains Mono" w:eastAsia="JetBrains Mono" w:hAnsi="JetBrains Mono" w:cs="JetBrains Mono"/>
@@ -7909,7 +8990,37 @@
         <w:sz w:val="14"/>
         <w:szCs w:val="14"/>
       </w:rPr>
-      <w:t xml:space="preserve">TekRevol · ChatGPT Ads Audit · Internal · </w:t>
+      <w:t>TekRevol</w:t>
+    </w:r>
+    <w:proofErr w:type="spellEnd"/>
+    <w:r>
+      <w:rPr>
+        <w:rFonts w:ascii="JetBrains Mono" w:eastAsia="JetBrains Mono" w:hAnsi="JetBrains Mono" w:cs="JetBrains Mono"/>
+        <w:color w:val="5E6166"/>
+        <w:sz w:val="14"/>
+        <w:szCs w:val="14"/>
+      </w:rPr>
+      <w:t xml:space="preserve"> · </w:t>
+    </w:r>
+    <w:proofErr w:type="spellStart"/>
+    <w:r>
+      <w:rPr>
+        <w:rFonts w:ascii="JetBrains Mono" w:eastAsia="JetBrains Mono" w:hAnsi="JetBrains Mono" w:cs="JetBrains Mono"/>
+        <w:color w:val="5E6166"/>
+        <w:sz w:val="14"/>
+        <w:szCs w:val="14"/>
+      </w:rPr>
+      <w:t>ChatGPT</w:t>
+    </w:r>
+    <w:proofErr w:type="spellEnd"/>
+    <w:r>
+      <w:rPr>
+        <w:rFonts w:ascii="JetBrains Mono" w:eastAsia="JetBrains Mono" w:hAnsi="JetBrains Mono" w:cs="JetBrains Mono"/>
+        <w:color w:val="5E6166"/>
+        <w:sz w:val="14"/>
+        <w:szCs w:val="14"/>
+      </w:rPr>
+      <w:t xml:space="preserve"> Ads Audit · Internal · </w:t>
     </w:r>
     <w:r>
       <w:rPr>
@@ -7986,7 +9097,7 @@
     <w:nsid w:val="1ABC5921"/>
     <w:multiLevelType w:val="hybridMultilevel"/>
     <w:tmpl w:val="3878E392"/>
-    <w:lvl w:ilvl="0" w:tplc="118A325C" w:tentative="1">
+    <w:lvl w:ilvl="0" w:tplc="118A325C">
       <w:start w:val="1"/>
       <w:numFmt w:val="decimal"/>
       <w:lvlText w:val="%1."/>
@@ -8056,7 +9167,7 @@
         <w:color w:val="FF4A1C"/>
       </w:rPr>
     </w:lvl>
-    <w:lvl w:ilvl="1" w:tplc="6E481934" w:tentative="1">
+    <w:lvl w:ilvl="1" w:tplc="6E481934">
       <w:start w:val="1"/>
       <w:numFmt w:val="bullet"/>
       <w:lvlText w:val="–"/>
@@ -8251,7 +9362,7 @@
     <w:nsid w:val="7FC57107"/>
     <w:multiLevelType w:val="hybridMultilevel"/>
     <w:tmpl w:val="DC8202DA"/>
-    <w:lvl w:ilvl="0" w:tplc="BAEEECB6" w:tentative="1">
+    <w:lvl w:ilvl="0" w:tplc="BAEEECB6">
       <w:start w:val="1"/>
       <w:numFmt w:val="bullet"/>
       <w:lvlText w:val="☐"/>

</xml_diff>